<commit_message>
Catedra i. protocolo individual 2
</commit_message>
<xml_diff>
--- a/Plantillas/Protocolos/PLANTILLA PROTOCOLO INDIVIDUAL.docx
+++ b/Plantillas/Protocolos/PLANTILLA PROTOCOLO INDIVIDUAL.docx
@@ -77,7 +77,7 @@
     </w:p>
     <w:tbl>
       <w:tblPr>
-        <w:tblStyle w:val="945"/>
+        <w:tblStyle w:val="948"/>
         <w:tblW w:w="8865" w:type="dxa"/>
         <w:tblBorders>
           <w:top w:val="single" w:color="000000" w:sz="4" w:space="0"/>
@@ -116,7 +116,7 @@
                 <w:rFonts w:ascii="Arial" w:hAnsi="Arial" w:eastAsia="Arial" w:cs="Arial"/>
                 <w:b/>
                 <w:bCs/>
-                <w:color w:val="002060"/>
+                <w:color w:val="000000" w:themeColor="text1"/>
                 <w:sz w:val="28"/>
                 <w:szCs w:val="28"/>
                 <w:highlight w:val="none"/>
@@ -131,7 +131,7 @@
                 <w:rFonts w:ascii="Arial" w:hAnsi="Arial" w:eastAsia="Arial" w:cs="Arial"/>
                 <w:b/>
                 <w:bCs/>
-                <w:color w:val="002060"/>
+                <w:color w:val="000000" w:themeColor="text1"/>
                 <w:sz w:val="28"/>
                 <w:szCs w:val="28"/>
                 <w:rtl w:val="0"/>
@@ -143,9 +143,10 @@
                 <w:rFonts w:ascii="Arial" w:hAnsi="Arial" w:eastAsia="Arial" w:cs="Arial"/>
                 <w:b/>
                 <w:bCs/>
-                <w:color w:val="002060"/>
+                <w:color w:val="000000" w:themeColor="text1"/>
                 <w:sz w:val="28"/>
                 <w:szCs w:val="28"/>
+                <w:highlight w:val="none"/>
               </w:rPr>
             </w:r>
             <w:r>
@@ -153,7 +154,7 @@
                 <w:rFonts w:ascii="Arial" w:hAnsi="Arial" w:eastAsia="Arial" w:cs="Arial"/>
                 <w:b/>
                 <w:bCs/>
-                <w:color w:val="002060"/>
+                <w:color w:val="000000" w:themeColor="text1"/>
                 <w:sz w:val="28"/>
                 <w:szCs w:val="28"/>
                 <w:highlight w:val="none"/>
@@ -179,6 +180,20 @@
             <w:r>
               <w:rPr>
                 <w:rFonts w:ascii="Arial" w:hAnsi="Arial" w:eastAsia="Arial" w:cs="Arial"/>
+                <w:b/>
+                <w:bCs/>
+                <w:color w:val="000000" w:themeColor="text1"/>
+                <w:sz w:val="28"/>
+                <w:szCs w:val="28"/>
+                <w:highlight w:val="none"/>
+                <w:rtl w:val="0"/>
+                <w:lang w:val="es-ES"/>
+              </w:rPr>
+              <w:t xml:space="preserve">Nombre:</w:t>
+            </w:r>
+            <w:r>
+              <w:rPr>
+                <w:rFonts w:ascii="Arial" w:hAnsi="Arial" w:eastAsia="Arial" w:cs="Arial"/>
                 <w:b w:val="0"/>
                 <w:bCs w:val="0"/>
                 <w:color w:val="000000" w:themeColor="text1"/>
@@ -188,7 +203,7 @@
                 <w:rtl w:val="0"/>
                 <w:lang w:val="es-ES"/>
               </w:rPr>
-              <w:t xml:space="preserve">Nombre: Esteban David Marrugo Jassir</w:t>
+              <w:t xml:space="preserve"> Esteban David Marrugo Jassir</w:t>
             </w:r>
             <w:r>
               <w:rPr>
@@ -198,6 +213,8 @@
                 <w:color w:val="000000" w:themeColor="text1"/>
                 <w:sz w:val="28"/>
                 <w:szCs w:val="28"/>
+                <w:highlight w:val="none"/>
+                <w:lang w:val="es-ES"/>
               </w:rPr>
             </w:r>
             <w:r>
@@ -209,7 +226,6 @@
                 <w:sz w:val="28"/>
                 <w:szCs w:val="28"/>
                 <w:highlight w:val="none"/>
-                <w:lang w:val="es-ES"/>
               </w:rPr>
             </w:r>
           </w:p>
@@ -232,6 +248,20 @@
             <w:r>
               <w:rPr>
                 <w:rFonts w:ascii="Arial" w:hAnsi="Arial" w:eastAsia="Arial" w:cs="Arial"/>
+                <w:b/>
+                <w:bCs/>
+                <w:color w:val="000000" w:themeColor="text1"/>
+                <w:sz w:val="28"/>
+                <w:szCs w:val="28"/>
+                <w:highlight w:val="none"/>
+                <w:rtl w:val="0"/>
+                <w:lang w:val="es-ES"/>
+              </w:rPr>
+              <w:t xml:space="preserve">Programa:</w:t>
+            </w:r>
+            <w:r>
+              <w:rPr>
+                <w:rFonts w:ascii="Arial" w:hAnsi="Arial" w:eastAsia="Arial" w:cs="Arial"/>
                 <w:b w:val="0"/>
                 <w:bCs w:val="0"/>
                 <w:color w:val="000000" w:themeColor="text1"/>
@@ -241,9 +271,22 @@
                 <w:rtl w:val="0"/>
                 <w:lang w:val="es-ES"/>
               </w:rPr>
-              <w:t xml:space="preserve">Programa: Ingeniería de Software</w:t>
+              <w:t xml:space="preserve"> Ingeniería de Software</w:t>
               <w:br/>
-              <w:t xml:space="preserve">Código: 7502620036</w:t>
+            </w:r>
+            <w:r>
+              <w:rPr>
+                <w:rFonts w:ascii="Arial" w:hAnsi="Arial" w:eastAsia="Arial" w:cs="Arial"/>
+                <w:b/>
+                <w:bCs/>
+                <w:color w:val="000000" w:themeColor="text1"/>
+                <w:sz w:val="28"/>
+                <w:szCs w:val="28"/>
+                <w:highlight w:val="none"/>
+                <w:rtl w:val="0"/>
+                <w:lang w:val="es-ES"/>
+              </w:rPr>
+              <w:t xml:space="preserve">Código:</w:t>
             </w:r>
             <w:r>
               <w:rPr>
@@ -253,6 +296,22 @@
                 <w:color w:val="000000" w:themeColor="text1"/>
                 <w:sz w:val="28"/>
                 <w:szCs w:val="28"/>
+                <w:highlight w:val="none"/>
+                <w:rtl w:val="0"/>
+                <w:lang w:val="es-ES"/>
+              </w:rPr>
+              <w:t xml:space="preserve"> 7502620036</w:t>
+            </w:r>
+            <w:r>
+              <w:rPr>
+                <w:rFonts w:ascii="Arial" w:hAnsi="Arial" w:eastAsia="Arial" w:cs="Arial"/>
+                <w:b w:val="0"/>
+                <w:bCs w:val="0"/>
+                <w:color w:val="000000" w:themeColor="text1"/>
+                <w:sz w:val="28"/>
+                <w:szCs w:val="28"/>
+                <w:highlight w:val="none"/>
+                <w:lang w:val="es-ES"/>
               </w:rPr>
             </w:r>
             <w:r>
@@ -264,7 +323,6 @@
                 <w:sz w:val="28"/>
                 <w:szCs w:val="28"/>
                 <w:highlight w:val="none"/>
-                <w:lang w:val="es-ES"/>
               </w:rPr>
             </w:r>
           </w:p>
@@ -286,8 +344,8 @@
             <w:r>
               <w:rPr>
                 <w:rFonts w:ascii="Arial" w:hAnsi="Arial" w:eastAsia="Arial" w:cs="Arial"/>
-                <w:b w:val="0"/>
-                <w:bCs w:val="0"/>
+                <w:b/>
+                <w:bCs/>
                 <w:color w:val="000000" w:themeColor="text1"/>
                 <w:sz w:val="28"/>
                 <w:szCs w:val="28"/>
@@ -295,7 +353,7 @@
                 <w:rtl w:val="0"/>
                 <w:lang w:val="es-ES"/>
               </w:rPr>
-              <w:t xml:space="preserve">Semestre: 1</w:t>
+              <w:t xml:space="preserve">Semestre: </w:t>
             </w:r>
             <w:r>
               <w:rPr>
@@ -308,6 +366,17 @@
                 <w:highlight w:val="none"/>
                 <w:rtl w:val="0"/>
                 <w:lang w:val="es-ES"/>
+              </w:rPr>
+              <w:t xml:space="preserve">1</w:t>
+            </w:r>
+            <w:r>
+              <w:rPr>
+                <w:rFonts w:ascii="Arial" w:hAnsi="Arial" w:eastAsia="Arial" w:cs="Arial"/>
+                <w:b w:val="0"/>
+                <w:bCs w:val="0"/>
+                <w:color w:val="000000" w:themeColor="text1"/>
+                <w:sz w:val="28"/>
+                <w:szCs w:val="28"/>
               </w:rPr>
             </w:r>
             <w:r>
@@ -364,30 +433,6 @@
                 <w:rtl w:val="0"/>
                 <w:lang w:val="es-ES"/>
               </w:rPr>
-              <w:t xml:space="preserve"> </w:t>
-            </w:r>
-            <w:r>
-              <w:rPr>
-                <w:rFonts w:ascii="Arial" w:hAnsi="Arial" w:eastAsia="Arial" w:cs="Arial"/>
-                <w:rtl w:val="0"/>
-                <w:lang w:val="es-ES"/>
-              </w:rPr>
-              <w:t xml:space="preserve">Lectura y análisis del Módulo de la Unidad 1 sobre la historia, conceptos y características de la Educación a Distancia, y el funcionamiento del Campus SIMA en la asignatura de Metodología de la Educación a </w:t>
-            </w:r>
-            <w:r>
-              <w:rPr>
-                <w:rFonts w:ascii="Arial" w:hAnsi="Arial" w:eastAsia="Arial" w:cs="Arial"/>
-                <w:rtl w:val="0"/>
-                <w:lang w:val="es-ES"/>
-              </w:rPr>
-              <w:t xml:space="preserve">Distancia.</w:t>
-            </w:r>
-            <w:r>
-              <w:rPr>
-                <w:rFonts w:ascii="Arial" w:hAnsi="Arial" w:eastAsia="Arial" w:cs="Arial"/>
-                <w:rtl w:val="0"/>
-                <w:lang w:val="es-ES"/>
-              </w:rPr>
             </w:r>
             <w:r/>
           </w:p>
@@ -426,15 +471,7 @@
                 <w:rtl w:val="0"/>
                 <w:lang w:val="es-ES"/>
               </w:rPr>
-              <w:t xml:space="preserve">: </w:t>
-            </w:r>
-            <w:r>
-              <w:rPr>
-                <w:rFonts w:ascii="Arial" w:hAnsi="Arial" w:eastAsia="Arial" w:cs="Arial"/>
-                <w:rtl w:val="0"/>
-                <w:lang w:val="es-ES"/>
-              </w:rPr>
-              <w:t xml:space="preserve">Educación a Distancia, Era Telemática, Aprendiente Autónomo, Tutor Mediador, Campus SIMA, CIPAS, Autorregulación, Momentos del Aprendizaje.</w:t>
+              <w:t xml:space="preserve">:</w:t>
             </w:r>
             <w:r>
               <w:rPr>
@@ -483,96 +520,10 @@
                 <w:rtl w:val="0"/>
                 <w:lang w:val="es-ES"/>
               </w:rPr>
-              <w:t xml:space="preserve">: </w:t>
+              <w:t xml:space="preserve">:</w:t>
             </w:r>
             <w:r>
               <w:rPr>
-                <w:rFonts w:ascii="Arial" w:hAnsi="Arial" w:eastAsia="Arial" w:cs="Arial"/>
-                <w:b w:val="0"/>
-                <w:bCs w:val="0"/>
-                <w:rtl w:val="0"/>
-                <w:lang w:val="es-ES"/>
-              </w:rPr>
-              <w:t xml:space="preserve">Comprender la evolución histórica de la Educación a Distancia desde la era de la correspondencia hasta el modelo telemático actual.</w:t>
-            </w:r>
-            <w:r>
-              <w:rPr>
-                <w:b w:val="0"/>
-                <w:bCs w:val="0"/>
-              </w:rPr>
-            </w:r>
-            <w:r>
-              <w:rPr>
-                <w:b w:val="0"/>
-                <w:bCs w:val="0"/>
-              </w:rPr>
-            </w:r>
-          </w:p>
-          <w:p>
-            <w:pPr>
-              <w:pBdr/>
-              <w:spacing w:line="360" w:lineRule="auto"/>
-              <w:ind/>
-              <w:jc w:val="both"/>
-              <w:rPr>
-                <w:b w:val="0"/>
-                <w:bCs w:val="0"/>
-              </w:rPr>
-            </w:pPr>
-            <w:r>
-              <w:rPr>
-                <w:rFonts w:ascii="Arial" w:hAnsi="Arial" w:eastAsia="Arial" w:cs="Arial"/>
-                <w:b w:val="0"/>
-                <w:bCs w:val="0"/>
-                <w:rtl w:val="0"/>
-                <w:lang w:val="es-ES"/>
-              </w:rPr>
-              <w:t xml:space="preserve">  Identificar la transformación de roles entre el aprendiente autónomo y el tutor mediador.</w:t>
-            </w:r>
-            <w:r>
-              <w:rPr>
-                <w:b w:val="0"/>
-                <w:bCs w:val="0"/>
-              </w:rPr>
-            </w:r>
-            <w:r>
-              <w:rPr>
-                <w:b w:val="0"/>
-                <w:bCs w:val="0"/>
-              </w:rPr>
-            </w:r>
-          </w:p>
-          <w:p>
-            <w:pPr>
-              <w:pBdr/>
-              <w:spacing w:line="360" w:lineRule="auto"/>
-              <w:ind/>
-              <w:jc w:val="both"/>
-              <w:rPr>
-                <w:rFonts w:ascii="Arial" w:hAnsi="Arial" w:eastAsia="Arial" w:cs="Arial"/>
-                <w:b w:val="0"/>
-                <w:bCs w:val="0"/>
-              </w:rPr>
-            </w:pPr>
-            <w:r>
-              <w:rPr>
-                <w:rFonts w:ascii="Arial" w:hAnsi="Arial" w:eastAsia="Arial" w:cs="Arial"/>
-                <w:b w:val="0"/>
-                <w:bCs w:val="0"/>
-                <w:rtl w:val="0"/>
-                <w:lang w:val="es-ES"/>
-              </w:rPr>
-              <w:t xml:space="preserve">  Conocer el funcionamiento del Campus SIMA y la dinámica de los 3 momentos del aprendizaje en la Universidad de Cartagena.</w:t>
-            </w:r>
-            <w:r>
-              <w:rPr>
-                <w:b w:val="0"/>
-                <w:bCs w:val="0"/>
-              </w:rPr>
-            </w:r>
-            <w:r>
-              <w:rPr>
-                <w:rFonts w:ascii="Arial" w:hAnsi="Arial" w:eastAsia="Arial" w:cs="Arial"/>
                 <w:b w:val="0"/>
                 <w:bCs w:val="0"/>
               </w:rPr>
@@ -623,206 +574,9 @@
                 <w:rtl w:val="0"/>
                 <w:lang w:val="es-ES"/>
               </w:rPr>
-              <w:t xml:space="preserve"> • </w:t>
-            </w:r>
-            <w:r>
-              <w:rPr>
-                <w:rFonts w:ascii="Arial" w:hAnsi="Arial" w:eastAsia="Arial" w:cs="Arial"/>
-                <w:b/>
-                <w:bCs/>
-                <w:rtl w:val="0"/>
-                <w:lang w:val="es-ES"/>
-              </w:rPr>
-              <w:t xml:space="preserve">Educación a Distancia (EAD): </w:t>
-            </w:r>
-            <w:r>
-              <w:rPr>
-                <w:rFonts w:ascii="Arial" w:hAnsi="Arial" w:eastAsia="Arial" w:cs="Arial"/>
-                <w:b w:val="0"/>
-                <w:bCs w:val="0"/>
-                <w:rtl w:val="0"/>
-                <w:lang w:val="es-ES"/>
-              </w:rPr>
-              <w:t xml:space="preserve">Es un modelo de estudio flexible que permite al estudiante aprender a su ritmo sin tener que ir todos los días a un aula física, usando plataformas virtuales y tutorías de apoyo.</w:t>
+              <w:t xml:space="preserve"> </w:t>
             </w:r>
             <w:r/>
-          </w:p>
-          <w:p>
-            <w:pPr>
-              <w:pBdr/>
-              <w:spacing w:line="360" w:lineRule="auto"/>
-              <w:ind/>
-              <w:jc w:val="both"/>
-              <w:rPr/>
-            </w:pPr>
-            <w:r>
-              <w:rPr>
-                <w:rFonts w:ascii="Arial" w:hAnsi="Arial" w:eastAsia="Arial" w:cs="Arial"/>
-                <w:b w:val="0"/>
-                <w:bCs w:val="0"/>
-                <w:rtl w:val="0"/>
-                <w:lang w:val="es-ES"/>
-              </w:rPr>
-              <w:t xml:space="preserve">  • </w:t>
-            </w:r>
-            <w:r>
-              <w:rPr>
-                <w:rFonts w:ascii="Arial" w:hAnsi="Arial" w:eastAsia="Arial" w:cs="Arial"/>
-                <w:b/>
-                <w:bCs/>
-                <w:rtl w:val="0"/>
-                <w:lang w:val="es-ES"/>
-              </w:rPr>
-              <w:t xml:space="preserve">Aprendiente Autónomo</w:t>
-            </w:r>
-            <w:r>
-              <w:rPr>
-                <w:rFonts w:ascii="Arial" w:hAnsi="Arial" w:eastAsia="Arial" w:cs="Arial"/>
-                <w:b w:val="0"/>
-                <w:bCs w:val="0"/>
-                <w:rtl w:val="0"/>
-                <w:lang w:val="es-ES"/>
-              </w:rPr>
-              <w:t xml:space="preserve">: Es el estudiante que toma la iniciativa, organiza sus propios horarios y crea sus rutinas de estudio sin necesitar que un profesor esté detrás diciéndole qué hacer.</w:t>
-            </w:r>
-            <w:r/>
-          </w:p>
-          <w:p>
-            <w:pPr>
-              <w:pBdr/>
-              <w:spacing w:line="360" w:lineRule="auto"/>
-              <w:ind/>
-              <w:jc w:val="both"/>
-              <w:rPr/>
-            </w:pPr>
-            <w:r>
-              <w:rPr>
-                <w:rFonts w:ascii="Arial" w:hAnsi="Arial" w:eastAsia="Arial" w:cs="Arial"/>
-                <w:b w:val="0"/>
-                <w:bCs w:val="0"/>
-                <w:rtl w:val="0"/>
-                <w:lang w:val="es-ES"/>
-              </w:rPr>
-              <w:t xml:space="preserve">  • </w:t>
-            </w:r>
-            <w:r>
-              <w:rPr>
-                <w:rFonts w:ascii="Arial" w:hAnsi="Arial" w:eastAsia="Arial" w:cs="Arial"/>
-                <w:b/>
-                <w:bCs/>
-                <w:rtl w:val="0"/>
-                <w:lang w:val="es-ES"/>
-              </w:rPr>
-              <w:t xml:space="preserve">Tutor Mediador</w:t>
-            </w:r>
-            <w:r>
-              <w:rPr>
-                <w:rFonts w:ascii="Arial" w:hAnsi="Arial" w:eastAsia="Arial" w:cs="Arial"/>
-                <w:b w:val="0"/>
-                <w:bCs w:val="0"/>
-                <w:rtl w:val="0"/>
-                <w:lang w:val="es-ES"/>
-              </w:rPr>
-              <w:t xml:space="preserve">: Es el rol del profesor en esta modalidad, donde en lugar de dar clases magistrales, se encarga de orientar, resolver dudas y guiar el aprendizaje.</w:t>
-            </w:r>
-            <w:r/>
-          </w:p>
-          <w:p>
-            <w:pPr>
-              <w:pBdr/>
-              <w:spacing w:line="360" w:lineRule="auto"/>
-              <w:ind/>
-              <w:jc w:val="both"/>
-              <w:rPr/>
-            </w:pPr>
-            <w:r>
-              <w:rPr>
-                <w:rFonts w:ascii="Arial" w:hAnsi="Arial" w:eastAsia="Arial" w:cs="Arial"/>
-                <w:b w:val="0"/>
-                <w:bCs w:val="0"/>
-                <w:rtl w:val="0"/>
-                <w:lang w:val="es-ES"/>
-              </w:rPr>
-              <w:t xml:space="preserve">  • </w:t>
-            </w:r>
-            <w:r>
-              <w:rPr>
-                <w:rFonts w:ascii="Arial" w:hAnsi="Arial" w:eastAsia="Arial" w:cs="Arial"/>
-                <w:b/>
-                <w:bCs/>
-                <w:rtl w:val="0"/>
-                <w:lang w:val="es-ES"/>
-              </w:rPr>
-              <w:t xml:space="preserve">B-Learning</w:t>
-            </w:r>
-            <w:r>
-              <w:rPr>
-                <w:rFonts w:ascii="Arial" w:hAnsi="Arial" w:eastAsia="Arial" w:cs="Arial"/>
-                <w:b w:val="0"/>
-                <w:bCs w:val="0"/>
-                <w:rtl w:val="0"/>
-                <w:lang w:val="es-ES"/>
-              </w:rPr>
-              <w:t xml:space="preserve">: Es el sistema mixto que usa la UDC, donde se combina el estudio por tu cuenta en la plataforma durante la semana con las tutorías sincrónicas los sábados.</w:t>
-            </w:r>
-            <w:r/>
-          </w:p>
-          <w:p>
-            <w:pPr>
-              <w:pBdr/>
-              <w:spacing w:line="360" w:lineRule="auto"/>
-              <w:ind/>
-              <w:jc w:val="both"/>
-              <w:rPr>
-                <w:rFonts w:ascii="Arial" w:hAnsi="Arial" w:eastAsia="Arial" w:cs="Arial"/>
-                <w:b w:val="0"/>
-                <w:bCs w:val="0"/>
-              </w:rPr>
-            </w:pPr>
-            <w:r>
-              <w:rPr>
-                <w:rFonts w:ascii="Arial" w:hAnsi="Arial" w:eastAsia="Arial" w:cs="Arial"/>
-                <w:b w:val="0"/>
-                <w:bCs w:val="0"/>
-                <w:rtl w:val="0"/>
-                <w:lang w:val="es-ES"/>
-              </w:rPr>
-              <w:t xml:space="preserve">  • </w:t>
-            </w:r>
-            <w:r>
-              <w:rPr>
-                <w:rFonts w:ascii="Arial" w:hAnsi="Arial" w:eastAsia="Arial" w:cs="Arial"/>
-                <w:b/>
-                <w:bCs/>
-                <w:rtl w:val="0"/>
-                <w:lang w:val="es-ES"/>
-              </w:rPr>
-              <w:t xml:space="preserve">Campus SIMA y CTEV</w:t>
-            </w:r>
-            <w:r>
-              <w:rPr>
-                <w:rFonts w:ascii="Arial" w:hAnsi="Arial" w:eastAsia="Arial" w:cs="Arial"/>
-                <w:b w:val="0"/>
-                <w:bCs w:val="0"/>
-                <w:rtl w:val="0"/>
-                <w:lang w:val="es-ES"/>
-              </w:rPr>
-              <w:t xml:space="preserve">: SIMA es la plataforma virtual donde subimos los protocolos y actividades, y el CTEV es el centro de la universidad que administra todo el sistema virtual.</w:t>
-            </w:r>
-            <w:r>
-              <w:rPr>
-                <w:rFonts w:ascii="Arial" w:hAnsi="Arial" w:eastAsia="Arial" w:cs="Arial"/>
-                <w:b w:val="0"/>
-                <w:bCs w:val="0"/>
-              </w:rPr>
-            </w:r>
-            <w:r>
-              <w:rPr>
-                <w:rFonts w:ascii="Arial" w:hAnsi="Arial" w:eastAsia="Arial" w:cs="Arial"/>
-                <w:b w:val="0"/>
-                <w:bCs w:val="0"/>
-              </w:rPr>
-            </w:r>
           </w:p>
         </w:tc>
       </w:tr>
@@ -860,230 +614,16 @@
                 <w:rtl w:val="0"/>
                 <w:lang w:val="es-ES"/>
               </w:rPr>
-              <w:t xml:space="preserve">: </w:t>
-            </w:r>
-            <w:r>
-              <w:rPr>
-                <w:rFonts w:ascii="Arial" w:hAnsi="Arial" w:eastAsia="Arial" w:cs="Arial"/>
-                <w:b w:val="0"/>
-                <w:bCs w:val="0"/>
-                <w:rtl w:val="0"/>
-                <w:lang w:val="es-ES"/>
-              </w:rPr>
-              <w:t xml:space="preserve">La metodología de la educación a distancia es una de las más flexibles porque le permite al estudiante la flexibilidad de estudiar manejando su tiempo y horarios, nació en 1840 siendo llamada la era de la</w:t>
+              <w:t xml:space="preserve">:</w:t>
             </w:r>
             <w:r/>
-          </w:p>
-          <w:p>
-            <w:pPr>
-              <w:pBdr/>
-              <w:spacing w:line="360" w:lineRule="auto"/>
-              <w:ind/>
-              <w:jc w:val="both"/>
-              <w:rPr/>
-            </w:pPr>
-            <w:r>
-              <w:rPr>
-                <w:rFonts w:ascii="Arial" w:hAnsi="Arial" w:eastAsia="Arial" w:cs="Arial"/>
-                <w:b w:val="0"/>
-                <w:bCs w:val="0"/>
-                <w:rtl w:val="0"/>
-                <w:lang w:val="es-ES"/>
-              </w:rPr>
-              <w:t xml:space="preserve">  correspondencia, luego evolucionaron a dictarse las clases por medios de telecomunicación, y hasta el día de hoy vemos el modelo telemático.</w:t>
-            </w:r>
-            <w:r/>
-          </w:p>
-          <w:p>
-            <w:pPr>
-              <w:pBdr/>
-              <w:spacing w:line="360" w:lineRule="auto"/>
-              <w:ind/>
-              <w:jc w:val="both"/>
-              <w:rPr/>
-            </w:pPr>
-            <w:r>
-              <w:rPr>
-                <w:rFonts w:ascii="Arial" w:hAnsi="Arial" w:eastAsia="Arial" w:cs="Arial"/>
-                <w:b w:val="0"/>
-                <w:bCs w:val="0"/>
-                <w:rtl w:val="0"/>
-                <w:lang w:val="es-ES"/>
-              </w:rPr>
-            </w:r>
-            <w:r/>
-          </w:p>
-          <w:p>
-            <w:pPr>
-              <w:pBdr/>
-              <w:spacing w:line="360" w:lineRule="auto"/>
-              <w:ind/>
-              <w:jc w:val="both"/>
-              <w:rPr/>
-            </w:pPr>
-            <w:r>
-              <w:rPr>
-                <w:rFonts w:ascii="Arial" w:hAnsi="Arial" w:eastAsia="Arial" w:cs="Arial"/>
-                <w:b w:val="0"/>
-                <w:bCs w:val="0"/>
-                <w:rtl w:val="0"/>
-                <w:lang w:val="es-ES"/>
-              </w:rPr>
-              <w:t xml:space="preserve">  Si bien nuestro rol sigue siendo de estudiante, la metodología de estudio es muy diferente a la que se lleva en modalidad presencial, porque aquí no hay un profesor encima supervisandonos a cada rato o diciendo cómo tenemos que hacer  las </w:t>
-            </w:r>
-            <w:r>
-              <w:rPr>
-                <w:rFonts w:ascii="Arial" w:hAnsi="Arial" w:eastAsia="Arial" w:cs="Arial"/>
-                <w:b w:val="0"/>
-                <w:bCs w:val="0"/>
-                <w:rtl w:val="0"/>
-                <w:lang w:val="es-ES"/>
-              </w:rPr>
-              <w:t xml:space="preserve">cosas. Aprendemos a nuestra manera, a nuestro ritmo y la mayor ventaja es que controlamos nuestro tiempo, y podemos estudiar casi desde cualquier parte. Claro, eso no quita el hecho de que para estudiar </w:t>
-            </w:r>
-            <w:r>
-              <w:rPr>
-                <w:rFonts w:ascii="Arial" w:hAnsi="Arial" w:eastAsia="Arial" w:cs="Arial"/>
-                <w:b w:val="0"/>
-                <w:bCs w:val="0"/>
-                <w:rtl w:val="0"/>
-                <w:lang w:val="es-ES"/>
-              </w:rPr>
-              <w:t xml:space="preserve">correctamente debemos elaborar rutinas de estudio, junto a metodologías que harán más eficaz nuestro aprendizaje.</w:t>
-            </w:r>
-            <w:r>
-              <w:rPr>
-                <w:rFonts w:ascii="Arial" w:hAnsi="Arial" w:eastAsia="Arial" w:cs="Arial"/>
-                <w:b w:val="0"/>
-                <w:bCs w:val="0"/>
-                <w:rtl w:val="0"/>
-                <w:lang w:val="es-ES"/>
-              </w:rPr>
-            </w:r>
-            <w:r/>
-          </w:p>
-          <w:p>
-            <w:pPr>
-              <w:pBdr/>
-              <w:spacing w:line="360" w:lineRule="auto"/>
-              <w:ind/>
-              <w:jc w:val="both"/>
-              <w:rPr/>
-            </w:pPr>
-            <w:r>
-              <w:rPr>
-                <w:rFonts w:ascii="Arial" w:hAnsi="Arial" w:eastAsia="Arial" w:cs="Arial"/>
-                <w:b w:val="0"/>
-                <w:bCs w:val="0"/>
-                <w:rtl w:val="0"/>
-                <w:lang w:val="es-ES"/>
-              </w:rPr>
-            </w:r>
-            <w:r/>
-          </w:p>
-          <w:p>
-            <w:pPr>
-              <w:pBdr/>
-              <w:spacing w:line="360" w:lineRule="auto"/>
-              <w:ind/>
-              <w:jc w:val="both"/>
-              <w:rPr/>
-            </w:pPr>
-            <w:r>
-              <w:rPr>
-                <w:rFonts w:ascii="Arial" w:hAnsi="Arial" w:eastAsia="Arial" w:cs="Arial"/>
-                <w:b w:val="0"/>
-                <w:bCs w:val="0"/>
-                <w:rtl w:val="0"/>
-                <w:lang w:val="es-ES"/>
-              </w:rPr>
-              <w:t xml:space="preserve">  En la UDC disponemos de 3 momentos, el individual: donde el estudiante estudia los temas dados por el tutor, se encarga de entender y captar las ideas por su cuenta para estar preparado al momento de dar la</w:t>
-            </w:r>
-            <w:r/>
-          </w:p>
-          <w:p>
-            <w:pPr>
-              <w:pBdr/>
-              <w:spacing w:line="360" w:lineRule="auto"/>
-              <w:ind/>
-              <w:jc w:val="both"/>
-              <w:rPr/>
-            </w:pPr>
-            <w:r>
-              <w:rPr>
-                <w:rFonts w:ascii="Arial" w:hAnsi="Arial" w:eastAsia="Arial" w:cs="Arial"/>
-                <w:b w:val="0"/>
-                <w:bCs w:val="0"/>
-                <w:rtl w:val="0"/>
-                <w:lang w:val="es-ES"/>
-              </w:rPr>
-              <w:t xml:space="preserve">  tutoría sincrónica donde realiza su protocolo individual. El momento colaborativo: aquí el estudiante se reúne con sus compañeros (CIPAS) y realizan actividades académicas dadas por el profesor, que</w:t>
-            </w:r>
-            <w:r/>
-          </w:p>
-          <w:p>
-            <w:pPr>
-              <w:pBdr/>
-              <w:spacing w:line="360" w:lineRule="auto"/>
-              <w:ind/>
-              <w:jc w:val="both"/>
-              <w:rPr/>
-            </w:pPr>
-            <w:r>
-              <w:rPr>
-                <w:rFonts w:ascii="Arial" w:hAnsi="Arial" w:eastAsia="Arial" w:cs="Arial"/>
-                <w:b w:val="0"/>
-                <w:bCs w:val="0"/>
-                <w:rtl w:val="0"/>
-                <w:lang w:val="es-ES"/>
-              </w:rPr>
-              <w:t xml:space="preserve">  normalmente suelen ser los protocolos colaborativos y tal vez actividades o parciales. Por último la tutoría: se reúnen de manera sincrónica tanto estudiantes como tutores los sábados dependiendo el horario</w:t>
-            </w:r>
-            <w:r/>
-          </w:p>
-          <w:p>
-            <w:pPr>
-              <w:pBdr/>
-              <w:spacing w:line="360" w:lineRule="auto"/>
-              <w:ind/>
-              <w:jc w:val="both"/>
-              <w:rPr>
-                <w:rFonts w:ascii="Arial" w:hAnsi="Arial" w:eastAsia="Arial" w:cs="Arial"/>
-                <w:b w:val="0"/>
-                <w:bCs w:val="0"/>
-              </w:rPr>
-            </w:pPr>
-            <w:r>
-              <w:rPr>
-                <w:rFonts w:ascii="Arial" w:hAnsi="Arial" w:eastAsia="Arial" w:cs="Arial"/>
-                <w:b w:val="0"/>
-                <w:bCs w:val="0"/>
-                <w:rtl w:val="0"/>
-                <w:lang w:val="es-ES"/>
-              </w:rPr>
-              <w:t xml:space="preserve">  establecido para aclarar dudas, repasar temas y resolver inquietudes.</w:t>
-            </w:r>
-            <w:r>
-              <w:rPr>
-                <w:rFonts w:ascii="Arial" w:hAnsi="Arial" w:eastAsia="Arial" w:cs="Arial"/>
-                <w:b w:val="0"/>
-                <w:bCs w:val="0"/>
-              </w:rPr>
-            </w:r>
-            <w:r>
-              <w:rPr>
-                <w:rFonts w:ascii="Arial" w:hAnsi="Arial" w:eastAsia="Arial" w:cs="Arial"/>
-                <w:b w:val="0"/>
-                <w:bCs w:val="0"/>
-              </w:rPr>
-            </w:r>
           </w:p>
         </w:tc>
       </w:tr>
       <w:tr>
         <w:trPr>
           <w:cantSplit w:val="false"/>
-          <w:trHeight w:val="4252"/>
+          <w:trHeight w:val="426"/>
         </w:trPr>
         <w:tc>
           <w:tcPr>
@@ -1107,7 +647,7 @@
                 <w:bCs/>
                 <w:rtl w:val="0"/>
               </w:rPr>
-              <w:t xml:space="preserve">Metodología de trabajo (Cómo realizó la actividad)</w:t>
+              <w:t xml:space="preserve">Metodología de trabaj</w:t>
             </w:r>
             <w:r>
               <w:rPr>
@@ -1117,96 +657,12 @@
                 <w:rtl w:val="0"/>
                 <w:lang w:val="es-ES"/>
               </w:rPr>
-              <w:t xml:space="preserve">: </w:t>
+              <w:t xml:space="preserve">o</w:t>
             </w:r>
+            <w:r/>
+            <w:r/>
             <w:r>
               <w:rPr>
-                <w:rFonts w:ascii="Arial" w:hAnsi="Arial" w:eastAsia="Arial" w:cs="Arial"/>
-                <w:b w:val="0"/>
-                <w:bCs w:val="0"/>
-                <w:rtl w:val="0"/>
-                <w:lang w:val="es-ES"/>
-              </w:rPr>
-              <w:t xml:space="preserve">Primeramente revisé cuidadosamente cada apartado de la materia en SIMA para asegurarme de entender cómo funciona, y aprender bien los conceptos, revisé apartados como el glosario, proyecto docente, guía de</w:t>
-            </w:r>
-            <w:r>
-              <w:rPr>
-                <w:b w:val="0"/>
-                <w:bCs w:val="0"/>
-              </w:rPr>
-            </w:r>
-            <w:r>
-              <w:rPr>
-                <w:b w:val="0"/>
-                <w:bCs w:val="0"/>
-              </w:rPr>
-            </w:r>
-          </w:p>
-          <w:p>
-            <w:pPr>
-              <w:pBdr/>
-              <w:spacing w:line="360" w:lineRule="auto"/>
-              <w:ind/>
-              <w:jc w:val="both"/>
-              <w:rPr>
-                <w:b w:val="0"/>
-                <w:bCs w:val="0"/>
-              </w:rPr>
-            </w:pPr>
-            <w:r>
-              <w:rPr>
-                <w:rFonts w:ascii="Arial" w:hAnsi="Arial" w:eastAsia="Arial" w:cs="Arial"/>
-                <w:b w:val="0"/>
-                <w:bCs w:val="0"/>
-                <w:rtl w:val="0"/>
-                <w:lang w:val="es-ES"/>
-              </w:rPr>
-              <w:t xml:space="preserve">  actividades y miré algunos videos. Con eso realizado empecé leyendo la guía de la unidad 1 para afianzar los conceptos y estudiar sobre los temas vistos, luego tomé apuntes de los temas y conceptos</w:t>
-            </w:r>
-            <w:r>
-              <w:rPr>
-                <w:b w:val="0"/>
-                <w:bCs w:val="0"/>
-              </w:rPr>
-            </w:r>
-            <w:r>
-              <w:rPr>
-                <w:b w:val="0"/>
-                <w:bCs w:val="0"/>
-              </w:rPr>
-            </w:r>
-          </w:p>
-          <w:p>
-            <w:pPr>
-              <w:pBdr/>
-              <w:spacing w:line="360" w:lineRule="auto"/>
-              <w:ind/>
-              <w:jc w:val="both"/>
-              <w:rPr>
-                <w:rFonts w:ascii="Arial" w:hAnsi="Arial" w:eastAsia="Arial" w:cs="Arial"/>
-                <w:b w:val="0"/>
-                <w:bCs w:val="0"/>
-              </w:rPr>
-            </w:pPr>
-            <w:r>
-              <w:rPr>
-                <w:rFonts w:ascii="Arial" w:hAnsi="Arial" w:eastAsia="Arial" w:cs="Arial"/>
-                <w:b w:val="0"/>
-                <w:bCs w:val="0"/>
-                <w:rtl w:val="0"/>
-                <w:lang w:val="es-ES"/>
-              </w:rPr>
-              <w:t xml:space="preserve">  importantes en mi plataforma de apuntes llamada Obsidian, realicé un repaso para verificar que entendía los conceptos y proseguí a realizar el protocolo individual.</w:t>
-            </w:r>
-            <w:r>
-              <w:rPr>
-                <w:b w:val="0"/>
-                <w:bCs w:val="0"/>
-              </w:rPr>
-            </w:r>
-            <w:r>
-              <w:rPr>
-                <w:rFonts w:ascii="Arial" w:hAnsi="Arial" w:eastAsia="Arial" w:cs="Arial"/>
                 <w:b w:val="0"/>
                 <w:bCs w:val="0"/>
               </w:rPr>
@@ -1245,79 +701,9 @@
                 <w:rtl w:val="0"/>
                 <w:lang w:val="es-ES"/>
               </w:rPr>
-              <w:t xml:space="preserve">: </w:t>
-            </w:r>
-            <w:r>
-              <w:rPr>
-                <w:rFonts w:ascii="Arial" w:hAnsi="Arial" w:eastAsia="Arial" w:cs="Arial"/>
-                <w:rtl w:val="0"/>
-                <w:lang w:val="es-ES"/>
-              </w:rPr>
-              <w:t xml:space="preserve">Al momento de realizar esta actividad me di cuenta de aspectos muy importantes, la educación a distancia no es tan simple como a veces se piensa</w:t>
-            </w:r>
-            <w:r>
-              <w:rPr>
-                <w:rFonts w:ascii="Arial" w:hAnsi="Arial" w:eastAsia="Arial" w:cs="Arial"/>
-                <w:rtl w:val="0"/>
-                <w:lang w:val="es-ES"/>
-              </w:rPr>
-              <w:t xml:space="preserve">. Estudiar a distancia no es simplemente estudiar cuando uno quiera, requiere disciplina, responsabilidad y aprender a organizar bien nuestro tiempo con rutinas y hábitos de estudio ya que sin</w:t>
-            </w:r>
-            <w:r>
-              <w:rPr>
-                <w:rFonts w:ascii="Arial" w:hAnsi="Arial" w:eastAsia="Arial" w:cs="Arial"/>
-                <w:rtl w:val="0"/>
-                <w:lang w:val="es-ES"/>
-              </w:rPr>
+              <w:t xml:space="preserve">:</w:t>
             </w:r>
             <w:r/>
-          </w:p>
-          <w:p>
-            <w:pPr>
-              <w:pBdr/>
-              <w:spacing w:line="360" w:lineRule="auto"/>
-              <w:ind/>
-              <w:jc w:val="both"/>
-              <w:rPr/>
-            </w:pPr>
-            <w:r>
-              <w:rPr>
-                <w:rFonts w:ascii="Arial" w:hAnsi="Arial" w:eastAsia="Arial" w:cs="Arial"/>
-                <w:rtl w:val="0"/>
-                <w:lang w:val="es-ES"/>
-              </w:rPr>
-              <w:t xml:space="preserve">  esto es muy difícil que lleguemos a aprender y a realizar nuestras actividades con éxito. También quedó claro el porqué debemos revisar todo el material con anticipación y tomar apuntes para llegar preparado</w:t>
-            </w:r>
-            <w:r/>
-          </w:p>
-          <w:p>
-            <w:pPr>
-              <w:pBdr/>
-              <w:spacing w:line="360" w:lineRule="auto"/>
-              <w:ind/>
-              <w:jc w:val="both"/>
-              <w:rPr>
-                <w:rFonts w:ascii="Arial" w:hAnsi="Arial" w:eastAsia="Arial" w:cs="Arial"/>
-              </w:rPr>
-            </w:pPr>
-            <w:r>
-              <w:rPr>
-                <w:rFonts w:ascii="Arial" w:hAnsi="Arial" w:eastAsia="Arial" w:cs="Arial"/>
-                <w:rtl w:val="0"/>
-                <w:lang w:val="es-ES"/>
-              </w:rPr>
-              <w:t xml:space="preserve">  a las tutorías, en mi caso descargué todo el material de estudio en una carpeta para cada materia y ahí voy realizando y estudiando según lo requiera.</w:t>
-            </w:r>
-            <w:r>
-              <w:rPr>
-                <w:rFonts w:ascii="Arial" w:hAnsi="Arial" w:eastAsia="Arial" w:cs="Arial"/>
-              </w:rPr>
-            </w:r>
-            <w:r>
-              <w:rPr>
-                <w:rFonts w:ascii="Arial" w:hAnsi="Arial" w:eastAsia="Arial" w:cs="Arial"/>
-              </w:rPr>
-            </w:r>
           </w:p>
         </w:tc>
       </w:tr>
@@ -1357,34 +743,12 @@
                 <w:rtl w:val="0"/>
                 <w:lang w:val="es-ES"/>
               </w:rPr>
-              <w:t xml:space="preserve">: </w:t>
+              <w:t xml:space="preserve">:</w:t>
             </w:r>
             <w:r>
               <w:rPr>
-                <w:rFonts w:ascii="Arial" w:hAnsi="Arial" w:eastAsia="Arial" w:cs="Arial"/>
                 <w:b w:val="0"/>
                 <w:bCs w:val="0"/>
-                <w:rtl w:val="0"/>
-                <w:lang w:val="es-ES"/>
-              </w:rPr>
-              <w:t xml:space="preserve">Los temas de la unidad me quedaron bastante claros y no tengo dudas sobre los conceptos principales. Como recomendación para el trabajo en el equipo CIPAS, me parece clave que organicemos bien los tiempos</w:t>
-            </w:r>
-            <w:r>
-              <w:rPr>
-                <w:rFonts w:ascii="Arial" w:hAnsi="Arial" w:eastAsia="Arial" w:cs="Arial"/>
-                <w:b w:val="0"/>
-                <w:bCs w:val="0"/>
-                <w:rtl w:val="0"/>
-                <w:lang w:val="es-ES"/>
-              </w:rPr>
-              <w:t xml:space="preserve"> para armar el protocolo colaborativo sin dejar todo a última hora, y aprovechar la tutoría del sábado para ir directo a las dudas puntuales de las actividades.</w:t>
-            </w:r>
-            <w:r>
-              <w:rPr>
-                <w:rFonts w:ascii="Arial" w:hAnsi="Arial" w:eastAsia="Arial" w:cs="Arial"/>
-                <w:b w:val="0"/>
-                <w:bCs w:val="0"/>
-                <w:rtl w:val="0"/>
               </w:rPr>
             </w:r>
             <w:r>
@@ -1432,96 +796,10 @@
                 <w:rtl w:val="0"/>
                 <w:lang w:val="es-ES"/>
               </w:rPr>
-              <w:t xml:space="preserve">: </w:t>
+              <w:t xml:space="preserve">:</w:t>
             </w:r>
             <w:r>
               <w:rPr>
-                <w:rFonts w:ascii="Arial" w:hAnsi="Arial" w:eastAsia="Arial" w:cs="Arial"/>
-                <w:b w:val="0"/>
-                <w:bCs w:val="0"/>
-                <w:rtl w:val="0"/>
-                <w:lang w:val="es-ES"/>
-              </w:rPr>
-              <w:t xml:space="preserve">• García Aretio, L. (2004). El material didáctico en la educación a distancia. RIED. Revista Iberoamericana de Educación a Distancia.</w:t>
-            </w:r>
-            <w:r>
-              <w:rPr>
-                <w:b w:val="0"/>
-                <w:bCs w:val="0"/>
-              </w:rPr>
-            </w:r>
-            <w:r>
-              <w:rPr>
-                <w:b w:val="0"/>
-                <w:bCs w:val="0"/>
-              </w:rPr>
-            </w:r>
-          </w:p>
-          <w:p>
-            <w:pPr>
-              <w:pBdr/>
-              <w:spacing w:line="360" w:lineRule="auto"/>
-              <w:ind/>
-              <w:jc w:val="both"/>
-              <w:rPr>
-                <w:b w:val="0"/>
-                <w:bCs w:val="0"/>
-              </w:rPr>
-            </w:pPr>
-            <w:r>
-              <w:rPr>
-                <w:rFonts w:ascii="Arial" w:hAnsi="Arial" w:eastAsia="Arial" w:cs="Arial"/>
-                <w:b w:val="0"/>
-                <w:bCs w:val="0"/>
-                <w:rtl w:val="0"/>
-                <w:lang w:val="es-ES"/>
-              </w:rPr>
-              <w:t xml:space="preserve">  • Universidad de Cartagena - CTEV. (2023). Módulo Didáctico Unidad 1: Metodología de la Educación a Distancia. Cartagena, Colombia.</w:t>
-            </w:r>
-            <w:r>
-              <w:rPr>
-                <w:b w:val="0"/>
-                <w:bCs w:val="0"/>
-              </w:rPr>
-            </w:r>
-            <w:r>
-              <w:rPr>
-                <w:b w:val="0"/>
-                <w:bCs w:val="0"/>
-              </w:rPr>
-            </w:r>
-          </w:p>
-          <w:p>
-            <w:pPr>
-              <w:pBdr/>
-              <w:spacing w:line="360" w:lineRule="auto"/>
-              <w:ind/>
-              <w:jc w:val="both"/>
-              <w:rPr>
-                <w:rFonts w:ascii="Arial" w:hAnsi="Arial" w:eastAsia="Arial" w:cs="Arial"/>
-                <w:b w:val="0"/>
-                <w:bCs w:val="0"/>
-              </w:rPr>
-            </w:pPr>
-            <w:r>
-              <w:rPr>
-                <w:rFonts w:ascii="Arial" w:hAnsi="Arial" w:eastAsia="Arial" w:cs="Arial"/>
-                <w:b w:val="0"/>
-                <w:bCs w:val="0"/>
-                <w:rtl w:val="0"/>
-                <w:lang w:val="es-ES"/>
-              </w:rPr>
-              <w:t xml:space="preserve">  • Universidad de Cartagena - Facultad de Ingeniería. (2024). Proyecto Docente: Metodologías y Estrategias de la Educación a Distancia (MEAD). Cartagena, Colombia.</w:t>
-            </w:r>
-            <w:r>
-              <w:rPr>
-                <w:b w:val="0"/>
-                <w:bCs w:val="0"/>
-              </w:rPr>
-            </w:r>
-            <w:r>
-              <w:rPr>
-                <w:rFonts w:ascii="Arial" w:hAnsi="Arial" w:eastAsia="Arial" w:cs="Arial"/>
                 <w:b w:val="0"/>
                 <w:bCs w:val="0"/>
               </w:rPr>
@@ -1543,6 +821,14 @@
           <w:color w:val="1f3864"/>
         </w:rPr>
       </w:pPr>
+      <w:r>
+        <w:rPr>
+          <w:rFonts w:ascii="Arial" w:hAnsi="Arial" w:eastAsia="Arial" w:cs="Arial"/>
+          <w:b/>
+          <w:bCs/>
+          <w:color w:val="1f3864"/>
+        </w:rPr>
+      </w:r>
       <w:r>
         <w:rPr>
           <w:rFonts w:ascii="Arial" w:hAnsi="Arial" w:eastAsia="Arial" w:cs="Arial"/>
@@ -2238,9 +1524,9 @@
     <w:lsdException w:name="Bibliography" w:uiPriority="37"/>
     <w:lsdException w:name="TOC Heading" w:uiPriority="39" w:qFormat="1"/>
   </w:latentStyles>
-  <w:style w:type="table" w:styleId="752">
+  <w:style w:type="table" w:styleId="755">
     <w:name w:val="Table Grid Light"/>
-    <w:basedOn w:val="936"/>
+    <w:basedOn w:val="939"/>
     <w:uiPriority w:val="59"/>
     <w:pPr>
       <w:pBdr/>
@@ -2437,9 +1723,9 @@
       </w:tcPr>
     </w:tblStylePr>
   </w:style>
-  <w:style w:type="table" w:styleId="753">
+  <w:style w:type="table" w:styleId="756">
     <w:name w:val="Plain Table 1"/>
-    <w:basedOn w:val="936"/>
+    <w:basedOn w:val="939"/>
     <w:uiPriority w:val="59"/>
     <w:pPr>
       <w:pBdr/>
@@ -2662,9 +1948,9 @@
       </w:tcPr>
     </w:tblStylePr>
   </w:style>
-  <w:style w:type="table" w:styleId="754">
+  <w:style w:type="table" w:styleId="757">
     <w:name w:val="Plain Table 2"/>
-    <w:basedOn w:val="936"/>
+    <w:basedOn w:val="939"/>
     <w:uiPriority w:val="59"/>
     <w:pPr>
       <w:pBdr/>
@@ -2895,9 +2181,9 @@
       </w:tcPr>
     </w:tblStylePr>
   </w:style>
-  <w:style w:type="table" w:styleId="755">
+  <w:style w:type="table" w:styleId="758">
     <w:name w:val="Plain Table 3"/>
-    <w:basedOn w:val="936"/>
+    <w:basedOn w:val="939"/>
     <w:uiPriority w:val="99"/>
     <w:pPr>
       <w:pBdr/>
@@ -3125,9 +2411,9 @@
       </w:tcPr>
     </w:tblStylePr>
   </w:style>
-  <w:style w:type="table" w:styleId="756">
+  <w:style w:type="table" w:styleId="759">
     <w:name w:val="Plain Table 4"/>
-    <w:basedOn w:val="936"/>
+    <w:basedOn w:val="939"/>
     <w:uiPriority w:val="99"/>
     <w:pPr>
       <w:pBdr/>
@@ -3341,9 +2627,9 @@
       </w:tcPr>
     </w:tblStylePr>
   </w:style>
-  <w:style w:type="table" w:styleId="757">
+  <w:style w:type="table" w:styleId="760">
     <w:name w:val="Plain Table 5"/>
-    <w:basedOn w:val="936"/>
+    <w:basedOn w:val="939"/>
     <w:uiPriority w:val="99"/>
     <w:pPr>
       <w:pBdr/>
@@ -3574,9 +2860,9 @@
       </w:tcPr>
     </w:tblStylePr>
   </w:style>
-  <w:style w:type="table" w:styleId="758">
+  <w:style w:type="table" w:styleId="761">
     <w:name w:val="Grid Table 1 Light"/>
-    <w:basedOn w:val="936"/>
+    <w:basedOn w:val="939"/>
     <w:uiPriority w:val="99"/>
     <w:pPr>
       <w:pBdr/>
@@ -3797,9 +3083,9 @@
       </w:tcPr>
     </w:tblStylePr>
   </w:style>
-  <w:style w:type="table" w:styleId="759">
+  <w:style w:type="table" w:styleId="762">
     <w:name w:val="Grid Table 1 Light - Accent 1"/>
-    <w:basedOn w:val="936"/>
+    <w:basedOn w:val="939"/>
     <w:uiPriority w:val="99"/>
     <w:pPr>
       <w:pBdr/>
@@ -4020,9 +3306,9 @@
       </w:tcPr>
     </w:tblStylePr>
   </w:style>
-  <w:style w:type="table" w:styleId="760">
+  <w:style w:type="table" w:styleId="763">
     <w:name w:val="Grid Table 1 Light - Accent 2"/>
-    <w:basedOn w:val="936"/>
+    <w:basedOn w:val="939"/>
     <w:uiPriority w:val="99"/>
     <w:pPr>
       <w:pBdr/>
@@ -4243,9 +3529,9 @@
       </w:tcPr>
     </w:tblStylePr>
   </w:style>
-  <w:style w:type="table" w:styleId="761">
+  <w:style w:type="table" w:styleId="764">
     <w:name w:val="Grid Table 1 Light - Accent 3"/>
-    <w:basedOn w:val="936"/>
+    <w:basedOn w:val="939"/>
     <w:uiPriority w:val="99"/>
     <w:pPr>
       <w:pBdr/>
@@ -4466,9 +3752,9 @@
       </w:tcPr>
     </w:tblStylePr>
   </w:style>
-  <w:style w:type="table" w:styleId="762">
+  <w:style w:type="table" w:styleId="765">
     <w:name w:val="Grid Table 1 Light - Accent 4"/>
-    <w:basedOn w:val="936"/>
+    <w:basedOn w:val="939"/>
     <w:uiPriority w:val="99"/>
     <w:pPr>
       <w:pBdr/>
@@ -4689,9 +3975,9 @@
       </w:tcPr>
     </w:tblStylePr>
   </w:style>
-  <w:style w:type="table" w:styleId="763">
+  <w:style w:type="table" w:styleId="766">
     <w:name w:val="Grid Table 1 Light - Accent 5"/>
-    <w:basedOn w:val="936"/>
+    <w:basedOn w:val="939"/>
     <w:uiPriority w:val="99"/>
     <w:pPr>
       <w:pBdr/>
@@ -4912,9 +4198,9 @@
       </w:tcPr>
     </w:tblStylePr>
   </w:style>
-  <w:style w:type="table" w:styleId="764">
+  <w:style w:type="table" w:styleId="767">
     <w:name w:val="Grid Table 1 Light - Accent 6"/>
-    <w:basedOn w:val="936"/>
+    <w:basedOn w:val="939"/>
     <w:uiPriority w:val="99"/>
     <w:pPr>
       <w:pBdr/>
@@ -5135,9 +4421,9 @@
       </w:tcPr>
     </w:tblStylePr>
   </w:style>
-  <w:style w:type="table" w:styleId="765">
+  <w:style w:type="table" w:styleId="768">
     <w:name w:val="Grid Table 2"/>
-    <w:basedOn w:val="936"/>
+    <w:basedOn w:val="939"/>
     <w:uiPriority w:val="99"/>
     <w:pPr>
       <w:pBdr/>
@@ -5367,9 +4653,9 @@
       </w:tcPr>
     </w:tblStylePr>
   </w:style>
-  <w:style w:type="table" w:styleId="766">
+  <w:style w:type="table" w:styleId="769">
     <w:name w:val="Grid Table 2 - Accent 1"/>
-    <w:basedOn w:val="936"/>
+    <w:basedOn w:val="939"/>
     <w:uiPriority w:val="99"/>
     <w:pPr>
       <w:pBdr/>
@@ -5599,9 +4885,9 @@
       </w:tcPr>
     </w:tblStylePr>
   </w:style>
-  <w:style w:type="table" w:styleId="767">
+  <w:style w:type="table" w:styleId="770">
     <w:name w:val="Grid Table 2 - Accent 2"/>
-    <w:basedOn w:val="936"/>
+    <w:basedOn w:val="939"/>
     <w:uiPriority w:val="99"/>
     <w:pPr>
       <w:pBdr/>
@@ -5831,9 +5117,9 @@
       </w:tcPr>
     </w:tblStylePr>
   </w:style>
-  <w:style w:type="table" w:styleId="768">
+  <w:style w:type="table" w:styleId="771">
     <w:name w:val="Grid Table 2 - Accent 3"/>
-    <w:basedOn w:val="936"/>
+    <w:basedOn w:val="939"/>
     <w:uiPriority w:val="99"/>
     <w:pPr>
       <w:pBdr/>
@@ -6063,9 +5349,9 @@
       </w:tcPr>
     </w:tblStylePr>
   </w:style>
-  <w:style w:type="table" w:styleId="769">
+  <w:style w:type="table" w:styleId="772">
     <w:name w:val="Grid Table 2 - Accent 4"/>
-    <w:basedOn w:val="936"/>
+    <w:basedOn w:val="939"/>
     <w:uiPriority w:val="99"/>
     <w:pPr>
       <w:pBdr/>
@@ -6295,9 +5581,9 @@
       </w:tcPr>
     </w:tblStylePr>
   </w:style>
-  <w:style w:type="table" w:styleId="770">
+  <w:style w:type="table" w:styleId="773">
     <w:name w:val="Grid Table 2 - Accent 5"/>
-    <w:basedOn w:val="936"/>
+    <w:basedOn w:val="939"/>
     <w:uiPriority w:val="99"/>
     <w:pPr>
       <w:pBdr/>
@@ -6527,9 +5813,9 @@
       </w:tcPr>
     </w:tblStylePr>
   </w:style>
-  <w:style w:type="table" w:styleId="771">
+  <w:style w:type="table" w:styleId="774">
     <w:name w:val="Grid Table 2 - Accent 6"/>
-    <w:basedOn w:val="936"/>
+    <w:basedOn w:val="939"/>
     <w:uiPriority w:val="99"/>
     <w:pPr>
       <w:pBdr/>
@@ -6759,9 +6045,9 @@
       </w:tcPr>
     </w:tblStylePr>
   </w:style>
-  <w:style w:type="table" w:styleId="772">
+  <w:style w:type="table" w:styleId="775">
     <w:name w:val="Grid Table 3"/>
-    <w:basedOn w:val="936"/>
+    <w:basedOn w:val="939"/>
     <w:uiPriority w:val="99"/>
     <w:pPr>
       <w:pBdr/>
@@ -7004,9 +6290,9 @@
       </w:tcPr>
     </w:tblStylePr>
   </w:style>
-  <w:style w:type="table" w:styleId="773">
+  <w:style w:type="table" w:styleId="776">
     <w:name w:val="Grid Table 3 - Accent 1"/>
-    <w:basedOn w:val="936"/>
+    <w:basedOn w:val="939"/>
     <w:uiPriority w:val="99"/>
     <w:pPr>
       <w:pBdr/>
@@ -7249,9 +6535,9 @@
       </w:tcPr>
     </w:tblStylePr>
   </w:style>
-  <w:style w:type="table" w:styleId="774">
+  <w:style w:type="table" w:styleId="777">
     <w:name w:val="Grid Table 3 - Accent 2"/>
-    <w:basedOn w:val="936"/>
+    <w:basedOn w:val="939"/>
     <w:uiPriority w:val="99"/>
     <w:pPr>
       <w:pBdr/>
@@ -7494,9 +6780,9 @@
       </w:tcPr>
     </w:tblStylePr>
   </w:style>
-  <w:style w:type="table" w:styleId="775">
+  <w:style w:type="table" w:styleId="778">
     <w:name w:val="Grid Table 3 - Accent 3"/>
-    <w:basedOn w:val="936"/>
+    <w:basedOn w:val="939"/>
     <w:uiPriority w:val="99"/>
     <w:pPr>
       <w:pBdr/>
@@ -7739,9 +7025,9 @@
       </w:tcPr>
     </w:tblStylePr>
   </w:style>
-  <w:style w:type="table" w:styleId="776">
+  <w:style w:type="table" w:styleId="779">
     <w:name w:val="Grid Table 3 - Accent 4"/>
-    <w:basedOn w:val="936"/>
+    <w:basedOn w:val="939"/>
     <w:uiPriority w:val="99"/>
     <w:pPr>
       <w:pBdr/>
@@ -7984,9 +7270,9 @@
       </w:tcPr>
     </w:tblStylePr>
   </w:style>
-  <w:style w:type="table" w:styleId="777">
+  <w:style w:type="table" w:styleId="780">
     <w:name w:val="Grid Table 3 - Accent 5"/>
-    <w:basedOn w:val="936"/>
+    <w:basedOn w:val="939"/>
     <w:uiPriority w:val="99"/>
     <w:pPr>
       <w:pBdr/>
@@ -8229,9 +7515,9 @@
       </w:tcPr>
     </w:tblStylePr>
   </w:style>
-  <w:style w:type="table" w:styleId="778">
+  <w:style w:type="table" w:styleId="781">
     <w:name w:val="Grid Table 3 - Accent 6"/>
-    <w:basedOn w:val="936"/>
+    <w:basedOn w:val="939"/>
     <w:uiPriority w:val="99"/>
     <w:pPr>
       <w:pBdr/>
@@ -8474,9 +7760,9 @@
       </w:tcPr>
     </w:tblStylePr>
   </w:style>
-  <w:style w:type="table" w:styleId="779">
+  <w:style w:type="table" w:styleId="782">
     <w:name w:val="Grid Table 4"/>
-    <w:basedOn w:val="936"/>
+    <w:basedOn w:val="939"/>
     <w:uiPriority w:val="59"/>
     <w:pPr>
       <w:pBdr/>
@@ -8707,9 +7993,9 @@
       </w:tcPr>
     </w:tblStylePr>
   </w:style>
-  <w:style w:type="table" w:styleId="780">
+  <w:style w:type="table" w:styleId="783">
     <w:name w:val="Grid Table 4 - Accent 1"/>
-    <w:basedOn w:val="936"/>
+    <w:basedOn w:val="939"/>
     <w:uiPriority w:val="59"/>
     <w:pPr>
       <w:pBdr/>
@@ -8940,9 +8226,9 @@
       </w:tcPr>
     </w:tblStylePr>
   </w:style>
-  <w:style w:type="table" w:styleId="781">
+  <w:style w:type="table" w:styleId="784">
     <w:name w:val="Grid Table 4 - Accent 2"/>
-    <w:basedOn w:val="936"/>
+    <w:basedOn w:val="939"/>
     <w:uiPriority w:val="59"/>
     <w:pPr>
       <w:pBdr/>
@@ -9173,9 +8459,9 @@
       </w:tcPr>
     </w:tblStylePr>
   </w:style>
-  <w:style w:type="table" w:styleId="782">
+  <w:style w:type="table" w:styleId="785">
     <w:name w:val="Grid Table 4 - Accent 3"/>
-    <w:basedOn w:val="936"/>
+    <w:basedOn w:val="939"/>
     <w:uiPriority w:val="59"/>
     <w:pPr>
       <w:pBdr/>
@@ -9406,9 +8692,9 @@
       </w:tcPr>
     </w:tblStylePr>
   </w:style>
-  <w:style w:type="table" w:styleId="783">
+  <w:style w:type="table" w:styleId="786">
     <w:name w:val="Grid Table 4 - Accent 4"/>
-    <w:basedOn w:val="936"/>
+    <w:basedOn w:val="939"/>
     <w:uiPriority w:val="59"/>
     <w:pPr>
       <w:pBdr/>
@@ -9639,9 +8925,9 @@
       </w:tcPr>
     </w:tblStylePr>
   </w:style>
-  <w:style w:type="table" w:styleId="784">
+  <w:style w:type="table" w:styleId="787">
     <w:name w:val="Grid Table 4 - Accent 5"/>
-    <w:basedOn w:val="936"/>
+    <w:basedOn w:val="939"/>
     <w:uiPriority w:val="59"/>
     <w:pPr>
       <w:pBdr/>
@@ -9872,9 +9158,9 @@
       </w:tcPr>
     </w:tblStylePr>
   </w:style>
-  <w:style w:type="table" w:styleId="785">
+  <w:style w:type="table" w:styleId="788">
     <w:name w:val="Grid Table 4 - Accent 6"/>
-    <w:basedOn w:val="936"/>
+    <w:basedOn w:val="939"/>
     <w:uiPriority w:val="59"/>
     <w:pPr>
       <w:pBdr/>
@@ -10105,9 +9391,9 @@
       </w:tcPr>
     </w:tblStylePr>
   </w:style>
-  <w:style w:type="table" w:styleId="786">
+  <w:style w:type="table" w:styleId="789">
     <w:name w:val="Grid Table 5 Dark"/>
-    <w:basedOn w:val="936"/>
+    <w:basedOn w:val="939"/>
     <w:uiPriority w:val="99"/>
     <w:pPr>
       <w:pBdr/>
@@ -10333,9 +9619,9 @@
       </w:tcPr>
     </w:tblStylePr>
   </w:style>
-  <w:style w:type="table" w:styleId="787">
+  <w:style w:type="table" w:styleId="790">
     <w:name w:val="Grid Table 5 Dark- Accent 1"/>
-    <w:basedOn w:val="936"/>
+    <w:basedOn w:val="939"/>
     <w:uiPriority w:val="99"/>
     <w:pPr>
       <w:pBdr/>
@@ -10561,9 +9847,9 @@
       </w:tcPr>
     </w:tblStylePr>
   </w:style>
-  <w:style w:type="table" w:styleId="788">
+  <w:style w:type="table" w:styleId="791">
     <w:name w:val="Grid Table 5 Dark - Accent 2"/>
-    <w:basedOn w:val="936"/>
+    <w:basedOn w:val="939"/>
     <w:uiPriority w:val="99"/>
     <w:pPr>
       <w:pBdr/>
@@ -10789,9 +10075,9 @@
       </w:tcPr>
     </w:tblStylePr>
   </w:style>
-  <w:style w:type="table" w:styleId="789">
+  <w:style w:type="table" w:styleId="792">
     <w:name w:val="Grid Table 5 Dark - Accent 3"/>
-    <w:basedOn w:val="936"/>
+    <w:basedOn w:val="939"/>
     <w:uiPriority w:val="99"/>
     <w:pPr>
       <w:pBdr/>
@@ -11017,9 +10303,9 @@
       </w:tcPr>
     </w:tblStylePr>
   </w:style>
-  <w:style w:type="table" w:styleId="790">
+  <w:style w:type="table" w:styleId="793">
     <w:name w:val="Grid Table 5 Dark- Accent 4"/>
-    <w:basedOn w:val="936"/>
+    <w:basedOn w:val="939"/>
     <w:uiPriority w:val="99"/>
     <w:pPr>
       <w:pBdr/>
@@ -11245,9 +10531,9 @@
       </w:tcPr>
     </w:tblStylePr>
   </w:style>
-  <w:style w:type="table" w:styleId="791">
+  <w:style w:type="table" w:styleId="794">
     <w:name w:val="Grid Table 5 Dark - Accent 5"/>
-    <w:basedOn w:val="936"/>
+    <w:basedOn w:val="939"/>
     <w:uiPriority w:val="99"/>
     <w:pPr>
       <w:pBdr/>
@@ -11473,9 +10759,9 @@
       </w:tcPr>
     </w:tblStylePr>
   </w:style>
-  <w:style w:type="table" w:styleId="792">
+  <w:style w:type="table" w:styleId="795">
     <w:name w:val="Grid Table 5 Dark - Accent 6"/>
-    <w:basedOn w:val="936"/>
+    <w:basedOn w:val="939"/>
     <w:uiPriority w:val="99"/>
     <w:pPr>
       <w:pBdr/>
@@ -11701,9 +10987,9 @@
       </w:tcPr>
     </w:tblStylePr>
   </w:style>
-  <w:style w:type="table" w:styleId="793">
+  <w:style w:type="table" w:styleId="796">
     <w:name w:val="Grid Table 6 Colorful"/>
-    <w:basedOn w:val="936"/>
+    <w:basedOn w:val="939"/>
     <w:uiPriority w:val="99"/>
     <w:pPr>
       <w:pBdr/>
@@ -11931,9 +11217,9 @@
       </w:tcPr>
     </w:tblStylePr>
   </w:style>
-  <w:style w:type="table" w:styleId="794">
+  <w:style w:type="table" w:styleId="797">
     <w:name w:val="Grid Table 6 Colorful - Accent 1"/>
-    <w:basedOn w:val="936"/>
+    <w:basedOn w:val="939"/>
     <w:uiPriority w:val="99"/>
     <w:pPr>
       <w:pBdr/>
@@ -12161,9 +11447,9 @@
       </w:tcPr>
     </w:tblStylePr>
   </w:style>
-  <w:style w:type="table" w:styleId="795">
+  <w:style w:type="table" w:styleId="798">
     <w:name w:val="Grid Table 6 Colorful - Accent 2"/>
-    <w:basedOn w:val="936"/>
+    <w:basedOn w:val="939"/>
     <w:uiPriority w:val="99"/>
     <w:pPr>
       <w:pBdr/>
@@ -12391,9 +11677,9 @@
       </w:tcPr>
     </w:tblStylePr>
   </w:style>
-  <w:style w:type="table" w:styleId="796">
+  <w:style w:type="table" w:styleId="799">
     <w:name w:val="Grid Table 6 Colorful - Accent 3"/>
-    <w:basedOn w:val="936"/>
+    <w:basedOn w:val="939"/>
     <w:uiPriority w:val="99"/>
     <w:pPr>
       <w:pBdr/>
@@ -12621,9 +11907,9 @@
       </w:tcPr>
     </w:tblStylePr>
   </w:style>
-  <w:style w:type="table" w:styleId="797">
+  <w:style w:type="table" w:styleId="800">
     <w:name w:val="Grid Table 6 Colorful - Accent 4"/>
-    <w:basedOn w:val="936"/>
+    <w:basedOn w:val="939"/>
     <w:uiPriority w:val="99"/>
     <w:pPr>
       <w:pBdr/>
@@ -12851,9 +12137,9 @@
       </w:tcPr>
     </w:tblStylePr>
   </w:style>
-  <w:style w:type="table" w:styleId="798">
+  <w:style w:type="table" w:styleId="801">
     <w:name w:val="Grid Table 6 Colorful - Accent 5"/>
-    <w:basedOn w:val="936"/>
+    <w:basedOn w:val="939"/>
     <w:uiPriority w:val="99"/>
     <w:pPr>
       <w:pBdr/>
@@ -13081,9 +12367,9 @@
       </w:tcPr>
     </w:tblStylePr>
   </w:style>
-  <w:style w:type="table" w:styleId="799">
+  <w:style w:type="table" w:styleId="802">
     <w:name w:val="Grid Table 6 Colorful - Accent 6"/>
-    <w:basedOn w:val="936"/>
+    <w:basedOn w:val="939"/>
     <w:uiPriority w:val="99"/>
     <w:pPr>
       <w:pBdr/>
@@ -13311,9 +12597,9 @@
       </w:tcPr>
     </w:tblStylePr>
   </w:style>
-  <w:style w:type="table" w:styleId="800">
+  <w:style w:type="table" w:styleId="803">
     <w:name w:val="Grid Table 7 Colorful"/>
-    <w:basedOn w:val="936"/>
+    <w:basedOn w:val="939"/>
     <w:uiPriority w:val="99"/>
     <w:pPr>
       <w:pBdr/>
@@ -13565,9 +12851,9 @@
       </w:tcPr>
     </w:tblStylePr>
   </w:style>
-  <w:style w:type="table" w:styleId="801">
+  <w:style w:type="table" w:styleId="804">
     <w:name w:val="Grid Table 7 Colorful - Accent 1"/>
-    <w:basedOn w:val="936"/>
+    <w:basedOn w:val="939"/>
     <w:uiPriority w:val="99"/>
     <w:pPr>
       <w:pBdr/>
@@ -13819,9 +13105,9 @@
       </w:tcPr>
     </w:tblStylePr>
   </w:style>
-  <w:style w:type="table" w:styleId="802">
+  <w:style w:type="table" w:styleId="805">
     <w:name w:val="Grid Table 7 Colorful - Accent 2"/>
-    <w:basedOn w:val="936"/>
+    <w:basedOn w:val="939"/>
     <w:uiPriority w:val="99"/>
     <w:pPr>
       <w:pBdr/>
@@ -14073,9 +13359,9 @@
       </w:tcPr>
     </w:tblStylePr>
   </w:style>
-  <w:style w:type="table" w:styleId="803">
+  <w:style w:type="table" w:styleId="806">
     <w:name w:val="Grid Table 7 Colorful - Accent 3"/>
-    <w:basedOn w:val="936"/>
+    <w:basedOn w:val="939"/>
     <w:uiPriority w:val="99"/>
     <w:pPr>
       <w:pBdr/>
@@ -14327,9 +13613,9 @@
       </w:tcPr>
     </w:tblStylePr>
   </w:style>
-  <w:style w:type="table" w:styleId="804">
+  <w:style w:type="table" w:styleId="807">
     <w:name w:val="Grid Table 7 Colorful - Accent 4"/>
-    <w:basedOn w:val="936"/>
+    <w:basedOn w:val="939"/>
     <w:uiPriority w:val="99"/>
     <w:pPr>
       <w:pBdr/>
@@ -14581,9 +13867,9 @@
       </w:tcPr>
     </w:tblStylePr>
   </w:style>
-  <w:style w:type="table" w:styleId="805">
+  <w:style w:type="table" w:styleId="808">
     <w:name w:val="Grid Table 7 Colorful - Accent 5"/>
-    <w:basedOn w:val="936"/>
+    <w:basedOn w:val="939"/>
     <w:uiPriority w:val="99"/>
     <w:pPr>
       <w:pBdr/>
@@ -14835,9 +14121,9 @@
       </w:tcPr>
     </w:tblStylePr>
   </w:style>
-  <w:style w:type="table" w:styleId="806">
+  <w:style w:type="table" w:styleId="809">
     <w:name w:val="Grid Table 7 Colorful - Accent 6"/>
-    <w:basedOn w:val="936"/>
+    <w:basedOn w:val="939"/>
     <w:uiPriority w:val="99"/>
     <w:pPr>
       <w:pBdr/>
@@ -15089,9 +14375,9 @@
       </w:tcPr>
     </w:tblStylePr>
   </w:style>
-  <w:style w:type="table" w:styleId="807">
+  <w:style w:type="table" w:styleId="810">
     <w:name w:val="List Table 1 Light"/>
-    <w:basedOn w:val="936"/>
+    <w:basedOn w:val="939"/>
     <w:uiPriority w:val="99"/>
     <w:pPr>
       <w:pBdr/>
@@ -15305,9 +14591,9 @@
       </w:tcPr>
     </w:tblStylePr>
   </w:style>
-  <w:style w:type="table" w:styleId="808">
+  <w:style w:type="table" w:styleId="811">
     <w:name w:val="List Table 1 Light - Accent 1"/>
-    <w:basedOn w:val="936"/>
+    <w:basedOn w:val="939"/>
     <w:uiPriority w:val="99"/>
     <w:pPr>
       <w:pBdr/>
@@ -15521,9 +14807,9 @@
       </w:tcPr>
     </w:tblStylePr>
   </w:style>
-  <w:style w:type="table" w:styleId="809">
+  <w:style w:type="table" w:styleId="812">
     <w:name w:val="List Table 1 Light - Accent 2"/>
-    <w:basedOn w:val="936"/>
+    <w:basedOn w:val="939"/>
     <w:uiPriority w:val="99"/>
     <w:pPr>
       <w:pBdr/>
@@ -15737,9 +15023,9 @@
       </w:tcPr>
     </w:tblStylePr>
   </w:style>
-  <w:style w:type="table" w:styleId="810">
+  <w:style w:type="table" w:styleId="813">
     <w:name w:val="List Table 1 Light - Accent 3"/>
-    <w:basedOn w:val="936"/>
+    <w:basedOn w:val="939"/>
     <w:uiPriority w:val="99"/>
     <w:pPr>
       <w:pBdr/>
@@ -15953,9 +15239,9 @@
       </w:tcPr>
     </w:tblStylePr>
   </w:style>
-  <w:style w:type="table" w:styleId="811">
+  <w:style w:type="table" w:styleId="814">
     <w:name w:val="List Table 1 Light - Accent 4"/>
-    <w:basedOn w:val="936"/>
+    <w:basedOn w:val="939"/>
     <w:uiPriority w:val="99"/>
     <w:pPr>
       <w:pBdr/>
@@ -16169,9 +15455,9 @@
       </w:tcPr>
     </w:tblStylePr>
   </w:style>
-  <w:style w:type="table" w:styleId="812">
+  <w:style w:type="table" w:styleId="815">
     <w:name w:val="List Table 1 Light - Accent 5"/>
-    <w:basedOn w:val="936"/>
+    <w:basedOn w:val="939"/>
     <w:uiPriority w:val="99"/>
     <w:pPr>
       <w:pBdr/>
@@ -16385,9 +15671,9 @@
       </w:tcPr>
     </w:tblStylePr>
   </w:style>
-  <w:style w:type="table" w:styleId="813">
+  <w:style w:type="table" w:styleId="816">
     <w:name w:val="List Table 1 Light - Accent 6"/>
-    <w:basedOn w:val="936"/>
+    <w:basedOn w:val="939"/>
     <w:uiPriority w:val="99"/>
     <w:pPr>
       <w:pBdr/>
@@ -16601,9 +15887,9 @@
       </w:tcPr>
     </w:tblStylePr>
   </w:style>
-  <w:style w:type="table" w:styleId="814">
+  <w:style w:type="table" w:styleId="817">
     <w:name w:val="List Table 2"/>
-    <w:basedOn w:val="936"/>
+    <w:basedOn w:val="939"/>
     <w:uiPriority w:val="99"/>
     <w:pPr>
       <w:pBdr/>
@@ -16839,9 +16125,9 @@
       </w:tcPr>
     </w:tblStylePr>
   </w:style>
-  <w:style w:type="table" w:styleId="815">
+  <w:style w:type="table" w:styleId="818">
     <w:name w:val="List Table 2 - Accent 1"/>
-    <w:basedOn w:val="936"/>
+    <w:basedOn w:val="939"/>
     <w:uiPriority w:val="99"/>
     <w:pPr>
       <w:pBdr/>
@@ -17077,9 +16363,9 @@
       </w:tcPr>
     </w:tblStylePr>
   </w:style>
-  <w:style w:type="table" w:styleId="816">
+  <w:style w:type="table" w:styleId="819">
     <w:name w:val="List Table 2 - Accent 2"/>
-    <w:basedOn w:val="936"/>
+    <w:basedOn w:val="939"/>
     <w:uiPriority w:val="99"/>
     <w:pPr>
       <w:pBdr/>
@@ -17315,9 +16601,9 @@
       </w:tcPr>
     </w:tblStylePr>
   </w:style>
-  <w:style w:type="table" w:styleId="817">
+  <w:style w:type="table" w:styleId="820">
     <w:name w:val="List Table 2 - Accent 3"/>
-    <w:basedOn w:val="936"/>
+    <w:basedOn w:val="939"/>
     <w:uiPriority w:val="99"/>
     <w:pPr>
       <w:pBdr/>
@@ -17553,9 +16839,9 @@
       </w:tcPr>
     </w:tblStylePr>
   </w:style>
-  <w:style w:type="table" w:styleId="818">
+  <w:style w:type="table" w:styleId="821">
     <w:name w:val="List Table 2 - Accent 4"/>
-    <w:basedOn w:val="936"/>
+    <w:basedOn w:val="939"/>
     <w:uiPriority w:val="99"/>
     <w:pPr>
       <w:pBdr/>
@@ -17791,9 +17077,9 @@
       </w:tcPr>
     </w:tblStylePr>
   </w:style>
-  <w:style w:type="table" w:styleId="819">
+  <w:style w:type="table" w:styleId="822">
     <w:name w:val="List Table 2 - Accent 5"/>
-    <w:basedOn w:val="936"/>
+    <w:basedOn w:val="939"/>
     <w:uiPriority w:val="99"/>
     <w:pPr>
       <w:pBdr/>
@@ -18029,9 +17315,9 @@
       </w:tcPr>
     </w:tblStylePr>
   </w:style>
-  <w:style w:type="table" w:styleId="820">
+  <w:style w:type="table" w:styleId="823">
     <w:name w:val="List Table 2 - Accent 6"/>
-    <w:basedOn w:val="936"/>
+    <w:basedOn w:val="939"/>
     <w:uiPriority w:val="99"/>
     <w:pPr>
       <w:pBdr/>
@@ -18267,9 +17553,9 @@
       </w:tcPr>
     </w:tblStylePr>
   </w:style>
-  <w:style w:type="table" w:styleId="821">
+  <w:style w:type="table" w:styleId="824">
     <w:name w:val="List Table 3"/>
-    <w:basedOn w:val="936"/>
+    <w:basedOn w:val="939"/>
     <w:uiPriority w:val="99"/>
     <w:pPr>
       <w:pBdr/>
@@ -18495,9 +17781,9 @@
       </w:tcPr>
     </w:tblStylePr>
   </w:style>
-  <w:style w:type="table" w:styleId="822">
+  <w:style w:type="table" w:styleId="825">
     <w:name w:val="List Table 3 - Accent 1"/>
-    <w:basedOn w:val="936"/>
+    <w:basedOn w:val="939"/>
     <w:uiPriority w:val="99"/>
     <w:pPr>
       <w:pBdr/>
@@ -18723,9 +18009,9 @@
       </w:tcPr>
     </w:tblStylePr>
   </w:style>
-  <w:style w:type="table" w:styleId="823">
+  <w:style w:type="table" w:styleId="826">
     <w:name w:val="List Table 3 - Accent 2"/>
-    <w:basedOn w:val="936"/>
+    <w:basedOn w:val="939"/>
     <w:uiPriority w:val="99"/>
     <w:pPr>
       <w:pBdr/>
@@ -18951,9 +18237,9 @@
       </w:tcPr>
     </w:tblStylePr>
   </w:style>
-  <w:style w:type="table" w:styleId="824">
+  <w:style w:type="table" w:styleId="827">
     <w:name w:val="List Table 3 - Accent 3"/>
-    <w:basedOn w:val="936"/>
+    <w:basedOn w:val="939"/>
     <w:uiPriority w:val="99"/>
     <w:pPr>
       <w:pBdr/>
@@ -19179,9 +18465,9 @@
       </w:tcPr>
     </w:tblStylePr>
   </w:style>
-  <w:style w:type="table" w:styleId="825">
+  <w:style w:type="table" w:styleId="828">
     <w:name w:val="List Table 3 - Accent 4"/>
-    <w:basedOn w:val="936"/>
+    <w:basedOn w:val="939"/>
     <w:uiPriority w:val="99"/>
     <w:pPr>
       <w:pBdr/>
@@ -19407,9 +18693,9 @@
       </w:tcPr>
     </w:tblStylePr>
   </w:style>
-  <w:style w:type="table" w:styleId="826">
+  <w:style w:type="table" w:styleId="829">
     <w:name w:val="List Table 3 - Accent 5"/>
-    <w:basedOn w:val="936"/>
+    <w:basedOn w:val="939"/>
     <w:uiPriority w:val="99"/>
     <w:pPr>
       <w:pBdr/>
@@ -19635,9 +18921,9 @@
       </w:tcPr>
     </w:tblStylePr>
   </w:style>
-  <w:style w:type="table" w:styleId="827">
+  <w:style w:type="table" w:styleId="830">
     <w:name w:val="List Table 3 - Accent 6"/>
-    <w:basedOn w:val="936"/>
+    <w:basedOn w:val="939"/>
     <w:uiPriority w:val="99"/>
     <w:pPr>
       <w:pBdr/>
@@ -19863,9 +19149,9 @@
       </w:tcPr>
     </w:tblStylePr>
   </w:style>
-  <w:style w:type="table" w:styleId="828">
+  <w:style w:type="table" w:styleId="831">
     <w:name w:val="List Table 4"/>
-    <w:basedOn w:val="936"/>
+    <w:basedOn w:val="939"/>
     <w:uiPriority w:val="99"/>
     <w:pPr>
       <w:pBdr/>
@@ -20088,9 +19374,9 @@
       </w:tcPr>
     </w:tblStylePr>
   </w:style>
-  <w:style w:type="table" w:styleId="829">
+  <w:style w:type="table" w:styleId="832">
     <w:name w:val="List Table 4 - Accent 1"/>
-    <w:basedOn w:val="936"/>
+    <w:basedOn w:val="939"/>
     <w:uiPriority w:val="99"/>
     <w:pPr>
       <w:pBdr/>
@@ -20313,9 +19599,9 @@
       </w:tcPr>
     </w:tblStylePr>
   </w:style>
-  <w:style w:type="table" w:styleId="830">
+  <w:style w:type="table" w:styleId="833">
     <w:name w:val="List Table 4 - Accent 2"/>
-    <w:basedOn w:val="936"/>
+    <w:basedOn w:val="939"/>
     <w:uiPriority w:val="99"/>
     <w:pPr>
       <w:pBdr/>
@@ -20538,9 +19824,9 @@
       </w:tcPr>
     </w:tblStylePr>
   </w:style>
-  <w:style w:type="table" w:styleId="831">
+  <w:style w:type="table" w:styleId="834">
     <w:name w:val="List Table 4 - Accent 3"/>
-    <w:basedOn w:val="936"/>
+    <w:basedOn w:val="939"/>
     <w:uiPriority w:val="99"/>
     <w:pPr>
       <w:pBdr/>
@@ -20763,9 +20049,9 @@
       </w:tcPr>
     </w:tblStylePr>
   </w:style>
-  <w:style w:type="table" w:styleId="832">
+  <w:style w:type="table" w:styleId="835">
     <w:name w:val="List Table 4 - Accent 4"/>
-    <w:basedOn w:val="936"/>
+    <w:basedOn w:val="939"/>
     <w:uiPriority w:val="99"/>
     <w:pPr>
       <w:pBdr/>
@@ -20988,9 +20274,9 @@
       </w:tcPr>
     </w:tblStylePr>
   </w:style>
-  <w:style w:type="table" w:styleId="833">
+  <w:style w:type="table" w:styleId="836">
     <w:name w:val="List Table 4 - Accent 5"/>
-    <w:basedOn w:val="936"/>
+    <w:basedOn w:val="939"/>
     <w:uiPriority w:val="99"/>
     <w:pPr>
       <w:pBdr/>
@@ -21213,9 +20499,9 @@
       </w:tcPr>
     </w:tblStylePr>
   </w:style>
-  <w:style w:type="table" w:styleId="834">
+  <w:style w:type="table" w:styleId="837">
     <w:name w:val="List Table 4 - Accent 6"/>
-    <w:basedOn w:val="936"/>
+    <w:basedOn w:val="939"/>
     <w:uiPriority w:val="99"/>
     <w:pPr>
       <w:pBdr/>
@@ -21438,9 +20724,9 @@
       </w:tcPr>
     </w:tblStylePr>
   </w:style>
-  <w:style w:type="table" w:styleId="835">
+  <w:style w:type="table" w:styleId="838">
     <w:name w:val="List Table 5 Dark"/>
-    <w:basedOn w:val="936"/>
+    <w:basedOn w:val="939"/>
     <w:uiPriority w:val="99"/>
     <w:pPr>
       <w:pBdr/>
@@ -21680,9 +20966,9 @@
       </w:tcPr>
     </w:tblStylePr>
   </w:style>
-  <w:style w:type="table" w:styleId="836">
+  <w:style w:type="table" w:styleId="839">
     <w:name w:val="List Table 5 Dark - Accent 1"/>
-    <w:basedOn w:val="936"/>
+    <w:basedOn w:val="939"/>
     <w:uiPriority w:val="99"/>
     <w:pPr>
       <w:pBdr/>
@@ -21922,9 +21208,9 @@
       </w:tcPr>
     </w:tblStylePr>
   </w:style>
-  <w:style w:type="table" w:styleId="837">
+  <w:style w:type="table" w:styleId="840">
     <w:name w:val="List Table 5 Dark - Accent 2"/>
-    <w:basedOn w:val="936"/>
+    <w:basedOn w:val="939"/>
     <w:uiPriority w:val="99"/>
     <w:pPr>
       <w:pBdr/>
@@ -22164,9 +21450,9 @@
       </w:tcPr>
     </w:tblStylePr>
   </w:style>
-  <w:style w:type="table" w:styleId="838">
+  <w:style w:type="table" w:styleId="841">
     <w:name w:val="List Table 5 Dark - Accent 3"/>
-    <w:basedOn w:val="936"/>
+    <w:basedOn w:val="939"/>
     <w:uiPriority w:val="99"/>
     <w:pPr>
       <w:pBdr/>
@@ -22406,9 +21692,9 @@
       </w:tcPr>
     </w:tblStylePr>
   </w:style>
-  <w:style w:type="table" w:styleId="839">
+  <w:style w:type="table" w:styleId="842">
     <w:name w:val="List Table 5 Dark - Accent 4"/>
-    <w:basedOn w:val="936"/>
+    <w:basedOn w:val="939"/>
     <w:uiPriority w:val="99"/>
     <w:pPr>
       <w:pBdr/>
@@ -22648,9 +21934,9 @@
       </w:tcPr>
     </w:tblStylePr>
   </w:style>
-  <w:style w:type="table" w:styleId="840">
+  <w:style w:type="table" w:styleId="843">
     <w:name w:val="List Table 5 Dark - Accent 5"/>
-    <w:basedOn w:val="936"/>
+    <w:basedOn w:val="939"/>
     <w:uiPriority w:val="99"/>
     <w:pPr>
       <w:pBdr/>
@@ -22890,9 +22176,9 @@
       </w:tcPr>
     </w:tblStylePr>
   </w:style>
-  <w:style w:type="table" w:styleId="841">
+  <w:style w:type="table" w:styleId="844">
     <w:name w:val="List Table 5 Dark - Accent 6"/>
-    <w:basedOn w:val="936"/>
+    <w:basedOn w:val="939"/>
     <w:uiPriority w:val="99"/>
     <w:pPr>
       <w:pBdr/>
@@ -23132,9 +22418,9 @@
       </w:tcPr>
     </w:tblStylePr>
   </w:style>
-  <w:style w:type="table" w:styleId="842">
+  <w:style w:type="table" w:styleId="845">
     <w:name w:val="List Table 6 Colorful"/>
-    <w:basedOn w:val="936"/>
+    <w:basedOn w:val="939"/>
     <w:uiPriority w:val="99"/>
     <w:pPr>
       <w:pBdr/>
@@ -23355,9 +22641,9 @@
       </w:tcPr>
     </w:tblStylePr>
   </w:style>
-  <w:style w:type="table" w:styleId="843">
+  <w:style w:type="table" w:styleId="846">
     <w:name w:val="List Table 6 Colorful - Accent 1"/>
-    <w:basedOn w:val="936"/>
+    <w:basedOn w:val="939"/>
     <w:uiPriority w:val="99"/>
     <w:pPr>
       <w:pBdr/>
@@ -23578,9 +22864,9 @@
       </w:tcPr>
     </w:tblStylePr>
   </w:style>
-  <w:style w:type="table" w:styleId="844">
+  <w:style w:type="table" w:styleId="847">
     <w:name w:val="List Table 6 Colorful - Accent 2"/>
-    <w:basedOn w:val="936"/>
+    <w:basedOn w:val="939"/>
     <w:uiPriority w:val="99"/>
     <w:pPr>
       <w:pBdr/>
@@ -23801,9 +23087,9 @@
       </w:tcPr>
     </w:tblStylePr>
   </w:style>
-  <w:style w:type="table" w:styleId="845">
+  <w:style w:type="table" w:styleId="848">
     <w:name w:val="List Table 6 Colorful - Accent 3"/>
-    <w:basedOn w:val="936"/>
+    <w:basedOn w:val="939"/>
     <w:uiPriority w:val="99"/>
     <w:pPr>
       <w:pBdr/>
@@ -24024,9 +23310,9 @@
       </w:tcPr>
     </w:tblStylePr>
   </w:style>
-  <w:style w:type="table" w:styleId="846">
+  <w:style w:type="table" w:styleId="849">
     <w:name w:val="List Table 6 Colorful - Accent 4"/>
-    <w:basedOn w:val="936"/>
+    <w:basedOn w:val="939"/>
     <w:uiPriority w:val="99"/>
     <w:pPr>
       <w:pBdr/>
@@ -24247,9 +23533,9 @@
       </w:tcPr>
     </w:tblStylePr>
   </w:style>
-  <w:style w:type="table" w:styleId="847">
+  <w:style w:type="table" w:styleId="850">
     <w:name w:val="List Table 6 Colorful - Accent 5"/>
-    <w:basedOn w:val="936"/>
+    <w:basedOn w:val="939"/>
     <w:uiPriority w:val="99"/>
     <w:pPr>
       <w:pBdr/>
@@ -24470,9 +23756,9 @@
       </w:tcPr>
     </w:tblStylePr>
   </w:style>
-  <w:style w:type="table" w:styleId="848">
+  <w:style w:type="table" w:styleId="851">
     <w:name w:val="List Table 6 Colorful - Accent 6"/>
-    <w:basedOn w:val="936"/>
+    <w:basedOn w:val="939"/>
     <w:uiPriority w:val="99"/>
     <w:pPr>
       <w:pBdr/>
@@ -24693,9 +23979,9 @@
       </w:tcPr>
     </w:tblStylePr>
   </w:style>
-  <w:style w:type="table" w:styleId="849">
+  <w:style w:type="table" w:styleId="852">
     <w:name w:val="List Table 7 Colorful"/>
-    <w:basedOn w:val="936"/>
+    <w:basedOn w:val="939"/>
     <w:uiPriority w:val="99"/>
     <w:pPr>
       <w:pBdr/>
@@ -24949,9 +24235,9 @@
       </w:tcPr>
     </w:tblStylePr>
   </w:style>
-  <w:style w:type="table" w:styleId="850">
+  <w:style w:type="table" w:styleId="853">
     <w:name w:val="List Table 7 Colorful - Accent 1"/>
-    <w:basedOn w:val="936"/>
+    <w:basedOn w:val="939"/>
     <w:uiPriority w:val="99"/>
     <w:pPr>
       <w:pBdr/>
@@ -25205,9 +24491,9 @@
       </w:tcPr>
     </w:tblStylePr>
   </w:style>
-  <w:style w:type="table" w:styleId="851">
+  <w:style w:type="table" w:styleId="854">
     <w:name w:val="List Table 7 Colorful - Accent 2"/>
-    <w:basedOn w:val="936"/>
+    <w:basedOn w:val="939"/>
     <w:uiPriority w:val="99"/>
     <w:pPr>
       <w:pBdr/>
@@ -25461,9 +24747,9 @@
       </w:tcPr>
     </w:tblStylePr>
   </w:style>
-  <w:style w:type="table" w:styleId="852">
+  <w:style w:type="table" w:styleId="855">
     <w:name w:val="List Table 7 Colorful - Accent 3"/>
-    <w:basedOn w:val="936"/>
+    <w:basedOn w:val="939"/>
     <w:uiPriority w:val="99"/>
     <w:pPr>
       <w:pBdr/>
@@ -25717,9 +25003,9 @@
       </w:tcPr>
     </w:tblStylePr>
   </w:style>
-  <w:style w:type="table" w:styleId="853">
+  <w:style w:type="table" w:styleId="856">
     <w:name w:val="List Table 7 Colorful - Accent 4"/>
-    <w:basedOn w:val="936"/>
+    <w:basedOn w:val="939"/>
     <w:uiPriority w:val="99"/>
     <w:pPr>
       <w:pBdr/>
@@ -25973,9 +25259,9 @@
       </w:tcPr>
     </w:tblStylePr>
   </w:style>
-  <w:style w:type="table" w:styleId="854">
+  <w:style w:type="table" w:styleId="857">
     <w:name w:val="List Table 7 Colorful - Accent 5"/>
-    <w:basedOn w:val="936"/>
+    <w:basedOn w:val="939"/>
     <w:uiPriority w:val="99"/>
     <w:pPr>
       <w:pBdr/>
@@ -26229,9 +25515,9 @@
       </w:tcPr>
     </w:tblStylePr>
   </w:style>
-  <w:style w:type="table" w:styleId="855">
+  <w:style w:type="table" w:styleId="858">
     <w:name w:val="List Table 7 Colorful - Accent 6"/>
-    <w:basedOn w:val="936"/>
+    <w:basedOn w:val="939"/>
     <w:uiPriority w:val="99"/>
     <w:pPr>
       <w:pBdr/>
@@ -26485,9 +25771,9 @@
       </w:tcPr>
     </w:tblStylePr>
   </w:style>
-  <w:style w:type="table" w:styleId="856">
+  <w:style w:type="table" w:styleId="859">
     <w:name w:val="Lined - Accent"/>
-    <w:basedOn w:val="936"/>
+    <w:basedOn w:val="939"/>
     <w:uiPriority w:val="99"/>
     <w:pPr>
       <w:pBdr/>
@@ -26722,9 +26008,9 @@
       </w:tcPr>
     </w:tblStylePr>
   </w:style>
-  <w:style w:type="table" w:styleId="857">
+  <w:style w:type="table" w:styleId="860">
     <w:name w:val="Lined - Accent 1"/>
-    <w:basedOn w:val="936"/>
+    <w:basedOn w:val="939"/>
     <w:uiPriority w:val="99"/>
     <w:pPr>
       <w:pBdr/>
@@ -26959,9 +26245,9 @@
       </w:tcPr>
     </w:tblStylePr>
   </w:style>
-  <w:style w:type="table" w:styleId="858">
+  <w:style w:type="table" w:styleId="861">
     <w:name w:val="Lined - Accent 2"/>
-    <w:basedOn w:val="936"/>
+    <w:basedOn w:val="939"/>
     <w:uiPriority w:val="99"/>
     <w:pPr>
       <w:pBdr/>
@@ -27196,9 +26482,9 @@
       </w:tcPr>
     </w:tblStylePr>
   </w:style>
-  <w:style w:type="table" w:styleId="859">
+  <w:style w:type="table" w:styleId="862">
     <w:name w:val="Lined - Accent 3"/>
-    <w:basedOn w:val="936"/>
+    <w:basedOn w:val="939"/>
     <w:uiPriority w:val="99"/>
     <w:pPr>
       <w:pBdr/>
@@ -27433,9 +26719,9 @@
       </w:tcPr>
     </w:tblStylePr>
   </w:style>
-  <w:style w:type="table" w:styleId="860">
+  <w:style w:type="table" w:styleId="863">
     <w:name w:val="Lined - Accent 4"/>
-    <w:basedOn w:val="936"/>
+    <w:basedOn w:val="939"/>
     <w:uiPriority w:val="99"/>
     <w:pPr>
       <w:pBdr/>
@@ -27670,9 +26956,9 @@
       </w:tcPr>
     </w:tblStylePr>
   </w:style>
-  <w:style w:type="table" w:styleId="861">
+  <w:style w:type="table" w:styleId="864">
     <w:name w:val="Lined - Accent 5"/>
-    <w:basedOn w:val="936"/>
+    <w:basedOn w:val="939"/>
     <w:uiPriority w:val="99"/>
     <w:pPr>
       <w:pBdr/>
@@ -27907,9 +27193,9 @@
       </w:tcPr>
     </w:tblStylePr>
   </w:style>
-  <w:style w:type="table" w:styleId="862">
+  <w:style w:type="table" w:styleId="865">
     <w:name w:val="Lined - Accent 6"/>
-    <w:basedOn w:val="936"/>
+    <w:basedOn w:val="939"/>
     <w:uiPriority w:val="99"/>
     <w:pPr>
       <w:pBdr/>
@@ -28144,9 +27430,9 @@
       </w:tcPr>
     </w:tblStylePr>
   </w:style>
-  <w:style w:type="table" w:styleId="863">
+  <w:style w:type="table" w:styleId="866">
     <w:name w:val="Bordered &amp; Lined - Accent"/>
-    <w:basedOn w:val="936"/>
+    <w:basedOn w:val="939"/>
     <w:uiPriority w:val="99"/>
     <w:pPr>
       <w:pBdr/>
@@ -28388,9 +27674,9 @@
       </w:tcPr>
     </w:tblStylePr>
   </w:style>
-  <w:style w:type="table" w:styleId="864">
+  <w:style w:type="table" w:styleId="867">
     <w:name w:val="Bordered &amp; Lined - Accent 1"/>
-    <w:basedOn w:val="936"/>
+    <w:basedOn w:val="939"/>
     <w:uiPriority w:val="99"/>
     <w:pPr>
       <w:pBdr/>
@@ -28632,9 +27918,9 @@
       </w:tcPr>
     </w:tblStylePr>
   </w:style>
-  <w:style w:type="table" w:styleId="865">
+  <w:style w:type="table" w:styleId="868">
     <w:name w:val="Bordered &amp; Lined - Accent 2"/>
-    <w:basedOn w:val="936"/>
+    <w:basedOn w:val="939"/>
     <w:uiPriority w:val="99"/>
     <w:pPr>
       <w:pBdr/>
@@ -28876,9 +28162,9 @@
       </w:tcPr>
     </w:tblStylePr>
   </w:style>
-  <w:style w:type="table" w:styleId="866">
+  <w:style w:type="table" w:styleId="869">
     <w:name w:val="Bordered &amp; Lined - Accent 3"/>
-    <w:basedOn w:val="936"/>
+    <w:basedOn w:val="939"/>
     <w:uiPriority w:val="99"/>
     <w:pPr>
       <w:pBdr/>
@@ -29120,9 +28406,9 @@
       </w:tcPr>
     </w:tblStylePr>
   </w:style>
-  <w:style w:type="table" w:styleId="867">
+  <w:style w:type="table" w:styleId="870">
     <w:name w:val="Bordered &amp; Lined - Accent 4"/>
-    <w:basedOn w:val="936"/>
+    <w:basedOn w:val="939"/>
     <w:uiPriority w:val="99"/>
     <w:pPr>
       <w:pBdr/>
@@ -29364,9 +28650,9 @@
       </w:tcPr>
     </w:tblStylePr>
   </w:style>
-  <w:style w:type="table" w:styleId="868">
+  <w:style w:type="table" w:styleId="871">
     <w:name w:val="Bordered &amp; Lined - Accent 5"/>
-    <w:basedOn w:val="936"/>
+    <w:basedOn w:val="939"/>
     <w:uiPriority w:val="99"/>
     <w:pPr>
       <w:pBdr/>
@@ -29608,9 +28894,9 @@
       </w:tcPr>
     </w:tblStylePr>
   </w:style>
-  <w:style w:type="table" w:styleId="869">
+  <w:style w:type="table" w:styleId="872">
     <w:name w:val="Bordered &amp; Lined - Accent 6"/>
-    <w:basedOn w:val="936"/>
+    <w:basedOn w:val="939"/>
     <w:uiPriority w:val="99"/>
     <w:pPr>
       <w:pBdr/>
@@ -29852,9 +29138,9 @@
       </w:tcPr>
     </w:tblStylePr>
   </w:style>
-  <w:style w:type="table" w:styleId="870">
+  <w:style w:type="table" w:styleId="873">
     <w:name w:val="Bordered"/>
-    <w:basedOn w:val="936"/>
+    <w:basedOn w:val="939"/>
     <w:uiPriority w:val="99"/>
     <w:pPr>
       <w:pBdr/>
@@ -30083,9 +29369,9 @@
       </w:tcPr>
     </w:tblStylePr>
   </w:style>
-  <w:style w:type="table" w:styleId="871">
+  <w:style w:type="table" w:styleId="874">
     <w:name w:val="Bordered - Accent 1"/>
-    <w:basedOn w:val="936"/>
+    <w:basedOn w:val="939"/>
     <w:uiPriority w:val="99"/>
     <w:pPr>
       <w:pBdr/>
@@ -30314,9 +29600,9 @@
       </w:tcPr>
     </w:tblStylePr>
   </w:style>
-  <w:style w:type="table" w:styleId="872">
+  <w:style w:type="table" w:styleId="875">
     <w:name w:val="Bordered - Accent 2"/>
-    <w:basedOn w:val="936"/>
+    <w:basedOn w:val="939"/>
     <w:uiPriority w:val="99"/>
     <w:pPr>
       <w:pBdr/>
@@ -30545,9 +29831,9 @@
       </w:tcPr>
     </w:tblStylePr>
   </w:style>
-  <w:style w:type="table" w:styleId="873">
+  <w:style w:type="table" w:styleId="876">
     <w:name w:val="Bordered - Accent 3"/>
-    <w:basedOn w:val="936"/>
+    <w:basedOn w:val="939"/>
     <w:uiPriority w:val="99"/>
     <w:pPr>
       <w:pBdr/>
@@ -30776,9 +30062,9 @@
       </w:tcPr>
     </w:tblStylePr>
   </w:style>
-  <w:style w:type="table" w:styleId="874">
+  <w:style w:type="table" w:styleId="877">
     <w:name w:val="Bordered - Accent 4"/>
-    <w:basedOn w:val="936"/>
+    <w:basedOn w:val="939"/>
     <w:uiPriority w:val="99"/>
     <w:pPr>
       <w:pBdr/>
@@ -31007,9 +30293,9 @@
       </w:tcPr>
     </w:tblStylePr>
   </w:style>
-  <w:style w:type="table" w:styleId="875">
+  <w:style w:type="table" w:styleId="878">
     <w:name w:val="Bordered - Accent 5"/>
-    <w:basedOn w:val="936"/>
+    <w:basedOn w:val="939"/>
     <w:uiPriority w:val="99"/>
     <w:pPr>
       <w:pBdr/>
@@ -31238,9 +30524,9 @@
       </w:tcPr>
     </w:tblStylePr>
   </w:style>
-  <w:style w:type="table" w:styleId="876">
+  <w:style w:type="table" w:styleId="879">
     <w:name w:val="Bordered - Accent 6"/>
-    <w:basedOn w:val="936"/>
+    <w:basedOn w:val="939"/>
     <w:uiPriority w:val="99"/>
     <w:pPr>
       <w:pBdr/>
@@ -31469,11 +30755,11 @@
       </w:tcPr>
     </w:tblStylePr>
   </w:style>
-  <w:style w:type="paragraph" w:styleId="877">
+  <w:style w:type="paragraph" w:styleId="880">
     <w:name w:val="Heading 7"/>
-    <w:basedOn w:val="934"/>
-    <w:next w:val="934"/>
-    <w:link w:val="886"/>
+    <w:basedOn w:val="937"/>
+    <w:next w:val="937"/>
+    <w:link w:val="889"/>
     <w:uiPriority w:val="9"/>
     <w:unhideWhenUsed/>
     <w:qFormat/>
@@ -31490,11 +30776,11 @@
       <w:color w:val="595959" w:themeColor="text1" w:themeTint="A6"/>
     </w:rPr>
   </w:style>
-  <w:style w:type="paragraph" w:styleId="878">
+  <w:style w:type="paragraph" w:styleId="881">
     <w:name w:val="Heading 8"/>
-    <w:basedOn w:val="934"/>
-    <w:next w:val="934"/>
-    <w:link w:val="887"/>
+    <w:basedOn w:val="937"/>
+    <w:next w:val="937"/>
+    <w:link w:val="890"/>
     <w:uiPriority w:val="9"/>
     <w:unhideWhenUsed/>
     <w:qFormat/>
@@ -31513,11 +30799,11 @@
       <w:color w:val="272727" w:themeColor="text1" w:themeTint="D8"/>
     </w:rPr>
   </w:style>
-  <w:style w:type="paragraph" w:styleId="879">
+  <w:style w:type="paragraph" w:styleId="882">
     <w:name w:val="Heading 9"/>
-    <w:basedOn w:val="934"/>
-    <w:next w:val="934"/>
-    <w:link w:val="888"/>
+    <w:basedOn w:val="937"/>
+    <w:next w:val="937"/>
+    <w:link w:val="891"/>
     <w:uiPriority w:val="9"/>
     <w:unhideWhenUsed/>
     <w:qFormat/>
@@ -31536,10 +30822,10 @@
       <w:color w:val="272727" w:themeColor="text1" w:themeTint="D8"/>
     </w:rPr>
   </w:style>
-  <w:style w:type="character" w:styleId="880">
+  <w:style w:type="character" w:styleId="883">
     <w:name w:val="Heading 1 Char"/>
-    <w:basedOn w:val="935"/>
-    <w:link w:val="927"/>
+    <w:basedOn w:val="938"/>
+    <w:link w:val="930"/>
     <w:uiPriority w:val="9"/>
     <w:pPr>
       <w:pBdr/>
@@ -31553,10 +30839,10 @@
       <w:szCs w:val="40"/>
     </w:rPr>
   </w:style>
-  <w:style w:type="character" w:styleId="881">
+  <w:style w:type="character" w:styleId="884">
     <w:name w:val="Heading 2 Char"/>
-    <w:basedOn w:val="935"/>
-    <w:link w:val="928"/>
+    <w:basedOn w:val="938"/>
+    <w:link w:val="931"/>
     <w:uiPriority w:val="9"/>
     <w:pPr>
       <w:pBdr/>
@@ -31570,10 +30856,10 @@
       <w:szCs w:val="32"/>
     </w:rPr>
   </w:style>
-  <w:style w:type="character" w:styleId="882">
+  <w:style w:type="character" w:styleId="885">
     <w:name w:val="Heading 3 Char"/>
-    <w:basedOn w:val="935"/>
-    <w:link w:val="929"/>
+    <w:basedOn w:val="938"/>
+    <w:link w:val="932"/>
     <w:uiPriority w:val="9"/>
     <w:pPr>
       <w:pBdr/>
@@ -31587,10 +30873,10 @@
       <w:szCs w:val="28"/>
     </w:rPr>
   </w:style>
-  <w:style w:type="character" w:styleId="883">
+  <w:style w:type="character" w:styleId="886">
     <w:name w:val="Heading 4 Char"/>
-    <w:basedOn w:val="935"/>
-    <w:link w:val="930"/>
+    <w:basedOn w:val="938"/>
+    <w:link w:val="933"/>
     <w:uiPriority w:val="9"/>
     <w:pPr>
       <w:pBdr/>
@@ -31604,10 +30890,10 @@
       <w:color w:val="0f4761" w:themeColor="accent1" w:themeShade="BF"/>
     </w:rPr>
   </w:style>
-  <w:style w:type="character" w:styleId="884">
+  <w:style w:type="character" w:styleId="887">
     <w:name w:val="Heading 5 Char"/>
-    <w:basedOn w:val="935"/>
-    <w:link w:val="931"/>
+    <w:basedOn w:val="938"/>
+    <w:link w:val="934"/>
     <w:uiPriority w:val="9"/>
     <w:pPr>
       <w:pBdr/>
@@ -31619,10 +30905,10 @@
       <w:color w:val="0f4761" w:themeColor="accent1" w:themeShade="BF"/>
     </w:rPr>
   </w:style>
-  <w:style w:type="character" w:styleId="885">
+  <w:style w:type="character" w:styleId="888">
     <w:name w:val="Heading 6 Char"/>
-    <w:basedOn w:val="935"/>
-    <w:link w:val="932"/>
+    <w:basedOn w:val="938"/>
+    <w:link w:val="935"/>
     <w:uiPriority w:val="9"/>
     <w:pPr>
       <w:pBdr/>
@@ -31636,10 +30922,10 @@
       <w:color w:val="595959" w:themeColor="text1" w:themeTint="A6"/>
     </w:rPr>
   </w:style>
-  <w:style w:type="character" w:styleId="886">
+  <w:style w:type="character" w:styleId="889">
     <w:name w:val="Heading 7 Char"/>
-    <w:basedOn w:val="935"/>
-    <w:link w:val="877"/>
+    <w:basedOn w:val="938"/>
+    <w:link w:val="880"/>
     <w:uiPriority w:val="9"/>
     <w:pPr>
       <w:pBdr/>
@@ -31651,10 +30937,10 @@
       <w:color w:val="595959" w:themeColor="text1" w:themeTint="A6"/>
     </w:rPr>
   </w:style>
-  <w:style w:type="character" w:styleId="887">
+  <w:style w:type="character" w:styleId="890">
     <w:name w:val="Heading 8 Char"/>
-    <w:basedOn w:val="935"/>
-    <w:link w:val="878"/>
+    <w:basedOn w:val="938"/>
+    <w:link w:val="881"/>
     <w:uiPriority w:val="9"/>
     <w:pPr>
       <w:pBdr/>
@@ -31668,10 +30954,10 @@
       <w:color w:val="272727" w:themeColor="text1" w:themeTint="D8"/>
     </w:rPr>
   </w:style>
-  <w:style w:type="character" w:styleId="888">
+  <w:style w:type="character" w:styleId="891">
     <w:name w:val="Heading 9 Char"/>
-    <w:basedOn w:val="935"/>
-    <w:link w:val="879"/>
+    <w:basedOn w:val="938"/>
+    <w:link w:val="882"/>
     <w:uiPriority w:val="9"/>
     <w:pPr>
       <w:pBdr/>
@@ -31685,10 +30971,10 @@
       <w:color w:val="272727" w:themeColor="text1" w:themeTint="D8"/>
     </w:rPr>
   </w:style>
-  <w:style w:type="character" w:styleId="889">
+  <w:style w:type="character" w:styleId="892">
     <w:name w:val="Title Char"/>
-    <w:basedOn w:val="935"/>
-    <w:link w:val="933"/>
+    <w:basedOn w:val="938"/>
+    <w:link w:val="936"/>
     <w:uiPriority w:val="10"/>
     <w:pPr>
       <w:pBdr/>
@@ -31702,10 +30988,10 @@
       <w:szCs w:val="56"/>
     </w:rPr>
   </w:style>
-  <w:style w:type="character" w:styleId="890">
+  <w:style w:type="character" w:styleId="893">
     <w:name w:val="Subtitle Char"/>
-    <w:basedOn w:val="935"/>
-    <w:link w:val="944"/>
+    <w:basedOn w:val="938"/>
+    <w:link w:val="947"/>
     <w:uiPriority w:val="11"/>
     <w:pPr>
       <w:pBdr/>
@@ -31719,11 +31005,11 @@
       <w:szCs w:val="28"/>
     </w:rPr>
   </w:style>
-  <w:style w:type="paragraph" w:styleId="891">
+  <w:style w:type="paragraph" w:styleId="894">
     <w:name w:val="Quote"/>
-    <w:basedOn w:val="934"/>
-    <w:next w:val="934"/>
-    <w:link w:val="892"/>
+    <w:basedOn w:val="937"/>
+    <w:next w:val="937"/>
+    <w:link w:val="895"/>
     <w:uiPriority w:val="29"/>
     <w:qFormat/>
     <w:pPr>
@@ -31738,10 +31024,10 @@
       <w:color w:val="404040" w:themeColor="text1" w:themeTint="BF"/>
     </w:rPr>
   </w:style>
-  <w:style w:type="character" w:styleId="892">
+  <w:style w:type="character" w:styleId="895">
     <w:name w:val="Quote Char"/>
-    <w:basedOn w:val="935"/>
-    <w:link w:val="891"/>
+    <w:basedOn w:val="938"/>
+    <w:link w:val="894"/>
     <w:uiPriority w:val="29"/>
     <w:pPr>
       <w:pBdr/>
@@ -31754,9 +31040,9 @@
       <w:color w:val="404040" w:themeColor="text1" w:themeTint="BF"/>
     </w:rPr>
   </w:style>
-  <w:style w:type="character" w:styleId="893">
+  <w:style w:type="character" w:styleId="896">
     <w:name w:val="Intense Emphasis"/>
-    <w:basedOn w:val="935"/>
+    <w:basedOn w:val="938"/>
     <w:uiPriority w:val="21"/>
     <w:qFormat/>
     <w:pPr>
@@ -31770,11 +31056,11 @@
       <w:color w:val="0f4761" w:themeColor="accent1" w:themeShade="BF"/>
     </w:rPr>
   </w:style>
-  <w:style w:type="paragraph" w:styleId="894">
+  <w:style w:type="paragraph" w:styleId="897">
     <w:name w:val="Intense Quote"/>
-    <w:basedOn w:val="934"/>
-    <w:next w:val="934"/>
-    <w:link w:val="895"/>
+    <w:basedOn w:val="937"/>
+    <w:next w:val="937"/>
+    <w:link w:val="898"/>
     <w:uiPriority w:val="30"/>
     <w:qFormat/>
     <w:pPr>
@@ -31792,10 +31078,10 @@
       <w:color w:val="0f4761" w:themeColor="accent1" w:themeShade="BF"/>
     </w:rPr>
   </w:style>
-  <w:style w:type="character" w:styleId="895">
+  <w:style w:type="character" w:styleId="898">
     <w:name w:val="Intense Quote Char"/>
-    <w:basedOn w:val="935"/>
-    <w:link w:val="894"/>
+    <w:basedOn w:val="938"/>
+    <w:link w:val="897"/>
     <w:uiPriority w:val="30"/>
     <w:pPr>
       <w:pBdr/>
@@ -31808,9 +31094,9 @@
       <w:color w:val="0f4761" w:themeColor="accent1" w:themeShade="BF"/>
     </w:rPr>
   </w:style>
-  <w:style w:type="character" w:styleId="896">
+  <w:style w:type="character" w:styleId="899">
     <w:name w:val="Intense Reference"/>
-    <w:basedOn w:val="935"/>
+    <w:basedOn w:val="938"/>
     <w:uiPriority w:val="32"/>
     <w:qFormat/>
     <w:pPr>
@@ -31826,9 +31112,9 @@
       <w:spacing w:val="5"/>
     </w:rPr>
   </w:style>
-  <w:style w:type="paragraph" w:styleId="897">
+  <w:style w:type="paragraph" w:styleId="900">
     <w:name w:val="No Spacing"/>
-    <w:basedOn w:val="934"/>
+    <w:basedOn w:val="937"/>
     <w:uiPriority w:val="1"/>
     <w:qFormat/>
     <w:pPr>
@@ -31837,9 +31123,9 @@
       <w:ind/>
     </w:pPr>
   </w:style>
-  <w:style w:type="character" w:styleId="898">
+  <w:style w:type="character" w:styleId="901">
     <w:name w:val="Subtle Emphasis"/>
-    <w:basedOn w:val="935"/>
+    <w:basedOn w:val="938"/>
     <w:uiPriority w:val="19"/>
     <w:qFormat/>
     <w:pPr>
@@ -31853,9 +31139,9 @@
       <w:color w:val="404040" w:themeColor="text1" w:themeTint="BF"/>
     </w:rPr>
   </w:style>
-  <w:style w:type="character" w:styleId="899">
+  <w:style w:type="character" w:styleId="902">
     <w:name w:val="Emphasis"/>
-    <w:basedOn w:val="935"/>
+    <w:basedOn w:val="938"/>
     <w:uiPriority w:val="20"/>
     <w:qFormat/>
     <w:pPr>
@@ -31868,9 +31154,9 @@
       <w:iCs/>
     </w:rPr>
   </w:style>
-  <w:style w:type="character" w:styleId="900">
+  <w:style w:type="character" w:styleId="903">
     <w:name w:val="Strong"/>
-    <w:basedOn w:val="935"/>
+    <w:basedOn w:val="938"/>
     <w:uiPriority w:val="22"/>
     <w:qFormat/>
     <w:pPr>
@@ -31883,9 +31169,9 @@
       <w:bCs/>
     </w:rPr>
   </w:style>
-  <w:style w:type="character" w:styleId="901">
+  <w:style w:type="character" w:styleId="904">
     <w:name w:val="Subtle Reference"/>
-    <w:basedOn w:val="935"/>
+    <w:basedOn w:val="938"/>
     <w:uiPriority w:val="31"/>
     <w:qFormat/>
     <w:pPr>
@@ -31898,9 +31184,9 @@
       <w:color w:val="5a5a5a" w:themeColor="text1" w:themeTint="A5"/>
     </w:rPr>
   </w:style>
-  <w:style w:type="character" w:styleId="902">
+  <w:style w:type="character" w:styleId="905">
     <w:name w:val="Book Title"/>
-    <w:basedOn w:val="935"/>
+    <w:basedOn w:val="938"/>
     <w:uiPriority w:val="33"/>
     <w:qFormat/>
     <w:pPr>
@@ -31916,10 +31202,10 @@
       <w:spacing w:val="5"/>
     </w:rPr>
   </w:style>
-  <w:style w:type="character" w:styleId="903">
+  <w:style w:type="character" w:styleId="906">
     <w:name w:val="Header Char"/>
-    <w:basedOn w:val="935"/>
-    <w:link w:val="938"/>
+    <w:basedOn w:val="938"/>
+    <w:link w:val="941"/>
     <w:uiPriority w:val="99"/>
     <w:pPr>
       <w:pBdr/>
@@ -31927,10 +31213,10 @@
       <w:ind/>
     </w:pPr>
   </w:style>
-  <w:style w:type="character" w:styleId="904">
+  <w:style w:type="character" w:styleId="907">
     <w:name w:val="Footer Char"/>
-    <w:basedOn w:val="935"/>
-    <w:link w:val="940"/>
+    <w:basedOn w:val="938"/>
+    <w:link w:val="943"/>
     <w:uiPriority w:val="99"/>
     <w:pPr>
       <w:pBdr/>
@@ -31938,10 +31224,10 @@
       <w:ind/>
     </w:pPr>
   </w:style>
-  <w:style w:type="paragraph" w:styleId="905">
+  <w:style w:type="paragraph" w:styleId="908">
     <w:name w:val="Caption"/>
-    <w:basedOn w:val="934"/>
-    <w:next w:val="934"/>
+    <w:basedOn w:val="937"/>
+    <w:next w:val="937"/>
     <w:uiPriority w:val="35"/>
     <w:unhideWhenUsed/>
     <w:qFormat/>
@@ -31958,57 +31244,9 @@
       <w:szCs w:val="18"/>
     </w:rPr>
   </w:style>
-  <w:style w:type="paragraph" w:styleId="906">
+  <w:style w:type="paragraph" w:styleId="909">
     <w:name w:val="footnote text"/>
-    <w:basedOn w:val="934"/>
-    <w:link w:val="907"/>
-    <w:uiPriority w:val="99"/>
-    <w:semiHidden/>
-    <w:unhideWhenUsed/>
-    <w:pPr>
-      <w:pBdr/>
-      <w:spacing w:after="0" w:line="240" w:lineRule="auto"/>
-      <w:ind/>
-    </w:pPr>
-    <w:rPr>
-      <w:sz w:val="20"/>
-      <w:szCs w:val="20"/>
-    </w:rPr>
-  </w:style>
-  <w:style w:type="character" w:styleId="907">
-    <w:name w:val="Footnote Text Char"/>
-    <w:basedOn w:val="935"/>
-    <w:link w:val="906"/>
-    <w:uiPriority w:val="99"/>
-    <w:semiHidden/>
-    <w:pPr>
-      <w:pBdr/>
-      <w:spacing/>
-      <w:ind/>
-    </w:pPr>
-    <w:rPr>
-      <w:sz w:val="20"/>
-      <w:szCs w:val="20"/>
-    </w:rPr>
-  </w:style>
-  <w:style w:type="character" w:styleId="908">
-    <w:name w:val="footnote reference"/>
-    <w:basedOn w:val="935"/>
-    <w:uiPriority w:val="99"/>
-    <w:semiHidden/>
-    <w:unhideWhenUsed/>
-    <w:pPr>
-      <w:pBdr/>
-      <w:spacing/>
-      <w:ind/>
-    </w:pPr>
-    <w:rPr>
-      <w:vertAlign w:val="superscript"/>
-    </w:rPr>
-  </w:style>
-  <w:style w:type="paragraph" w:styleId="909">
-    <w:name w:val="endnote text"/>
-    <w:basedOn w:val="934"/>
+    <w:basedOn w:val="937"/>
     <w:link w:val="910"/>
     <w:uiPriority w:val="99"/>
     <w:semiHidden/>
@@ -32024,8 +31262,8 @@
     </w:rPr>
   </w:style>
   <w:style w:type="character" w:styleId="910">
-    <w:name w:val="Endnote Text Char"/>
-    <w:basedOn w:val="935"/>
+    <w:name w:val="Footnote Text Char"/>
+    <w:basedOn w:val="938"/>
     <w:link w:val="909"/>
     <w:uiPriority w:val="99"/>
     <w:semiHidden/>
@@ -32040,8 +31278,8 @@
     </w:rPr>
   </w:style>
   <w:style w:type="character" w:styleId="911">
-    <w:name w:val="endnote reference"/>
-    <w:basedOn w:val="935"/>
+    <w:name w:val="footnote reference"/>
+    <w:basedOn w:val="938"/>
     <w:uiPriority w:val="99"/>
     <w:semiHidden/>
     <w:unhideWhenUsed/>
@@ -32054,9 +31292,57 @@
       <w:vertAlign w:val="superscript"/>
     </w:rPr>
   </w:style>
-  <w:style w:type="character" w:styleId="912">
+  <w:style w:type="paragraph" w:styleId="912">
+    <w:name w:val="endnote text"/>
+    <w:basedOn w:val="937"/>
+    <w:link w:val="913"/>
+    <w:uiPriority w:val="99"/>
+    <w:semiHidden/>
+    <w:unhideWhenUsed/>
+    <w:pPr>
+      <w:pBdr/>
+      <w:spacing w:after="0" w:line="240" w:lineRule="auto"/>
+      <w:ind/>
+    </w:pPr>
+    <w:rPr>
+      <w:sz w:val="20"/>
+      <w:szCs w:val="20"/>
+    </w:rPr>
+  </w:style>
+  <w:style w:type="character" w:styleId="913">
+    <w:name w:val="Endnote Text Char"/>
+    <w:basedOn w:val="938"/>
+    <w:link w:val="912"/>
+    <w:uiPriority w:val="99"/>
+    <w:semiHidden/>
+    <w:pPr>
+      <w:pBdr/>
+      <w:spacing/>
+      <w:ind/>
+    </w:pPr>
+    <w:rPr>
+      <w:sz w:val="20"/>
+      <w:szCs w:val="20"/>
+    </w:rPr>
+  </w:style>
+  <w:style w:type="character" w:styleId="914">
+    <w:name w:val="endnote reference"/>
+    <w:basedOn w:val="938"/>
+    <w:uiPriority w:val="99"/>
+    <w:semiHidden/>
+    <w:unhideWhenUsed/>
+    <w:pPr>
+      <w:pBdr/>
+      <w:spacing/>
+      <w:ind/>
+    </w:pPr>
+    <w:rPr>
+      <w:vertAlign w:val="superscript"/>
+    </w:rPr>
+  </w:style>
+  <w:style w:type="character" w:styleId="915">
     <w:name w:val="Hyperlink"/>
-    <w:basedOn w:val="935"/>
+    <w:basedOn w:val="938"/>
     <w:uiPriority w:val="99"/>
     <w:unhideWhenUsed/>
     <w:pPr>
@@ -32069,9 +31355,9 @@
       <w:u w:val="single"/>
     </w:rPr>
   </w:style>
-  <w:style w:type="character" w:styleId="913">
+  <w:style w:type="character" w:styleId="916">
     <w:name w:val="FollowedHyperlink"/>
-    <w:basedOn w:val="935"/>
+    <w:basedOn w:val="938"/>
     <w:uiPriority w:val="99"/>
     <w:semiHidden/>
     <w:unhideWhenUsed/>
@@ -32085,10 +31371,10 @@
       <w:u w:val="single"/>
     </w:rPr>
   </w:style>
-  <w:style w:type="paragraph" w:styleId="914">
+  <w:style w:type="paragraph" w:styleId="917">
     <w:name w:val="toc 1"/>
-    <w:basedOn w:val="934"/>
-    <w:next w:val="934"/>
+    <w:basedOn w:val="937"/>
+    <w:next w:val="937"/>
     <w:uiPriority w:val="39"/>
     <w:unhideWhenUsed/>
     <w:pPr>
@@ -32097,10 +31383,10 @@
       <w:ind/>
     </w:pPr>
   </w:style>
-  <w:style w:type="paragraph" w:styleId="915">
+  <w:style w:type="paragraph" w:styleId="918">
     <w:name w:val="toc 2"/>
-    <w:basedOn w:val="934"/>
-    <w:next w:val="934"/>
+    <w:basedOn w:val="937"/>
+    <w:next w:val="937"/>
     <w:uiPriority w:val="39"/>
     <w:unhideWhenUsed/>
     <w:pPr>
@@ -32109,10 +31395,10 @@
       <w:ind w:left="220"/>
     </w:pPr>
   </w:style>
-  <w:style w:type="paragraph" w:styleId="916">
+  <w:style w:type="paragraph" w:styleId="919">
     <w:name w:val="toc 3"/>
-    <w:basedOn w:val="934"/>
-    <w:next w:val="934"/>
+    <w:basedOn w:val="937"/>
+    <w:next w:val="937"/>
     <w:uiPriority w:val="39"/>
     <w:unhideWhenUsed/>
     <w:pPr>
@@ -32121,10 +31407,10 @@
       <w:ind w:left="440"/>
     </w:pPr>
   </w:style>
-  <w:style w:type="paragraph" w:styleId="917">
+  <w:style w:type="paragraph" w:styleId="920">
     <w:name w:val="toc 4"/>
-    <w:basedOn w:val="934"/>
-    <w:next w:val="934"/>
+    <w:basedOn w:val="937"/>
+    <w:next w:val="937"/>
     <w:uiPriority w:val="39"/>
     <w:unhideWhenUsed/>
     <w:pPr>
@@ -32133,10 +31419,10 @@
       <w:ind w:left="660"/>
     </w:pPr>
   </w:style>
-  <w:style w:type="paragraph" w:styleId="918">
+  <w:style w:type="paragraph" w:styleId="921">
     <w:name w:val="toc 5"/>
-    <w:basedOn w:val="934"/>
-    <w:next w:val="934"/>
+    <w:basedOn w:val="937"/>
+    <w:next w:val="937"/>
     <w:uiPriority w:val="39"/>
     <w:unhideWhenUsed/>
     <w:pPr>
@@ -32145,10 +31431,10 @@
       <w:ind w:left="880"/>
     </w:pPr>
   </w:style>
-  <w:style w:type="paragraph" w:styleId="919">
+  <w:style w:type="paragraph" w:styleId="922">
     <w:name w:val="toc 6"/>
-    <w:basedOn w:val="934"/>
-    <w:next w:val="934"/>
+    <w:basedOn w:val="937"/>
+    <w:next w:val="937"/>
     <w:uiPriority w:val="39"/>
     <w:unhideWhenUsed/>
     <w:pPr>
@@ -32157,10 +31443,10 @@
       <w:ind w:left="1100"/>
     </w:pPr>
   </w:style>
-  <w:style w:type="paragraph" w:styleId="920">
+  <w:style w:type="paragraph" w:styleId="923">
     <w:name w:val="toc 7"/>
-    <w:basedOn w:val="934"/>
-    <w:next w:val="934"/>
+    <w:basedOn w:val="937"/>
+    <w:next w:val="937"/>
     <w:uiPriority w:val="39"/>
     <w:unhideWhenUsed/>
     <w:pPr>
@@ -32169,10 +31455,10 @@
       <w:ind w:left="1320"/>
     </w:pPr>
   </w:style>
-  <w:style w:type="paragraph" w:styleId="921">
+  <w:style w:type="paragraph" w:styleId="924">
     <w:name w:val="toc 8"/>
-    <w:basedOn w:val="934"/>
-    <w:next w:val="934"/>
+    <w:basedOn w:val="937"/>
+    <w:next w:val="937"/>
     <w:uiPriority w:val="39"/>
     <w:unhideWhenUsed/>
     <w:pPr>
@@ -32181,10 +31467,10 @@
       <w:ind w:left="1540"/>
     </w:pPr>
   </w:style>
-  <w:style w:type="paragraph" w:styleId="922">
+  <w:style w:type="paragraph" w:styleId="925">
     <w:name w:val="toc 9"/>
-    <w:basedOn w:val="934"/>
-    <w:next w:val="934"/>
+    <w:basedOn w:val="937"/>
+    <w:next w:val="937"/>
     <w:uiPriority w:val="39"/>
     <w:unhideWhenUsed/>
     <w:pPr>
@@ -32193,9 +31479,9 @@
       <w:ind w:left="1760"/>
     </w:pPr>
   </w:style>
-  <w:style w:type="character" w:styleId="923">
+  <w:style w:type="character" w:styleId="926">
     <w:name w:val="Placeholder Text"/>
-    <w:basedOn w:val="935"/>
+    <w:basedOn w:val="938"/>
     <w:uiPriority w:val="99"/>
     <w:semiHidden/>
     <w:pPr>
@@ -32207,7 +31493,7 @@
       <w:color w:val="666666"/>
     </w:rPr>
   </w:style>
-  <w:style w:type="paragraph" w:styleId="924">
+  <w:style w:type="paragraph" w:styleId="927">
     <w:name w:val="TOC Heading"/>
     <w:uiPriority w:val="39"/>
     <w:unhideWhenUsed/>
@@ -32217,10 +31503,10 @@
       <w:ind/>
     </w:pPr>
   </w:style>
-  <w:style w:type="paragraph" w:styleId="925">
+  <w:style w:type="paragraph" w:styleId="928">
     <w:name w:val="table of figures"/>
-    <w:basedOn w:val="934"/>
-    <w:next w:val="934"/>
+    <w:basedOn w:val="937"/>
+    <w:next w:val="937"/>
     <w:uiPriority w:val="99"/>
     <w:unhideWhenUsed/>
     <w:pPr>
@@ -32229,7 +31515,7 @@
       <w:ind/>
     </w:pPr>
   </w:style>
-  <w:style w:type="table" w:styleId="926">
+  <w:style w:type="table" w:styleId="929">
     <w:name w:val="TableNormal"/>
     <w:pPr>
       <w:pBdr/>
@@ -32418,10 +31704,10 @@
       </w:tcPr>
     </w:tblStylePr>
   </w:style>
-  <w:style w:type="paragraph" w:styleId="927">
+  <w:style w:type="paragraph" w:styleId="930">
     <w:name w:val="Heading 1"/>
-    <w:basedOn w:val="934"/>
-    <w:next w:val="934"/>
+    <w:basedOn w:val="937"/>
+    <w:next w:val="937"/>
     <w:pPr>
       <w:keepNext w:val="true"/>
       <w:keepLines w:val="true"/>
@@ -32437,10 +31723,10 @@
       <w:szCs w:val="48"/>
     </w:rPr>
   </w:style>
-  <w:style w:type="paragraph" w:styleId="928">
+  <w:style w:type="paragraph" w:styleId="931">
     <w:name w:val="Heading 2"/>
-    <w:basedOn w:val="934"/>
-    <w:next w:val="934"/>
+    <w:basedOn w:val="937"/>
+    <w:next w:val="937"/>
     <w:pPr>
       <w:keepNext w:val="true"/>
       <w:keepLines w:val="true"/>
@@ -32456,10 +31742,10 @@
       <w:szCs w:val="36"/>
     </w:rPr>
   </w:style>
-  <w:style w:type="paragraph" w:styleId="929">
+  <w:style w:type="paragraph" w:styleId="932">
     <w:name w:val="Heading 3"/>
-    <w:basedOn w:val="934"/>
-    <w:next w:val="934"/>
+    <w:basedOn w:val="937"/>
+    <w:next w:val="937"/>
     <w:pPr>
       <w:keepNext w:val="true"/>
       <w:keepLines w:val="true"/>
@@ -32475,10 +31761,10 @@
       <w:szCs w:val="28"/>
     </w:rPr>
   </w:style>
-  <w:style w:type="paragraph" w:styleId="930">
+  <w:style w:type="paragraph" w:styleId="933">
     <w:name w:val="Heading 4"/>
-    <w:basedOn w:val="934"/>
-    <w:next w:val="934"/>
+    <w:basedOn w:val="937"/>
+    <w:next w:val="937"/>
     <w:pPr>
       <w:keepNext w:val="true"/>
       <w:keepLines w:val="true"/>
@@ -32494,10 +31780,10 @@
       <w:szCs w:val="24"/>
     </w:rPr>
   </w:style>
-  <w:style w:type="paragraph" w:styleId="931">
+  <w:style w:type="paragraph" w:styleId="934">
     <w:name w:val="Heading 5"/>
-    <w:basedOn w:val="934"/>
-    <w:next w:val="934"/>
+    <w:basedOn w:val="937"/>
+    <w:next w:val="937"/>
     <w:pPr>
       <w:keepNext w:val="true"/>
       <w:keepLines w:val="true"/>
@@ -32513,10 +31799,10 @@
       <w:szCs w:val="22"/>
     </w:rPr>
   </w:style>
-  <w:style w:type="paragraph" w:styleId="932">
+  <w:style w:type="paragraph" w:styleId="935">
     <w:name w:val="Heading 6"/>
-    <w:basedOn w:val="934"/>
-    <w:next w:val="934"/>
+    <w:basedOn w:val="937"/>
+    <w:next w:val="937"/>
     <w:pPr>
       <w:keepNext w:val="true"/>
       <w:keepLines w:val="true"/>
@@ -32532,10 +31818,10 @@
       <w:szCs w:val="20"/>
     </w:rPr>
   </w:style>
-  <w:style w:type="paragraph" w:styleId="933">
+  <w:style w:type="paragraph" w:styleId="936">
     <w:name w:val="Title"/>
-    <w:basedOn w:val="934"/>
-    <w:next w:val="934"/>
+    <w:basedOn w:val="937"/>
+    <w:next w:val="937"/>
     <w:pPr>
       <w:keepNext w:val="true"/>
       <w:keepLines w:val="true"/>
@@ -32551,7 +31837,7 @@
       <w:szCs w:val="72"/>
     </w:rPr>
   </w:style>
-  <w:style w:type="paragraph" w:styleId="934" w:default="1">
+  <w:style w:type="paragraph" w:styleId="937" w:default="1">
     <w:name w:val="Normal"/>
     <w:qFormat/>
     <w:pPr>
@@ -32564,7 +31850,7 @@
       <w:lang w:eastAsia="es-MX"/>
     </w:rPr>
   </w:style>
-  <w:style w:type="character" w:styleId="935" w:default="1">
+  <w:style w:type="character" w:styleId="938" w:default="1">
     <w:name w:val="Default Paragraph Font"/>
     <w:uiPriority w:val="1"/>
     <w:semiHidden/>
@@ -32575,7 +31861,7 @@
       <w:ind/>
     </w:pPr>
   </w:style>
-  <w:style w:type="table" w:styleId="936" w:default="1">
+  <w:style w:type="table" w:styleId="939" w:default="1">
     <w:name w:val="Normal Table"/>
     <w:uiPriority w:val="99"/>
     <w:semiHidden/>
@@ -32768,7 +32054,7 @@
       </w:tcPr>
     </w:tblStylePr>
   </w:style>
-  <w:style w:type="numbering" w:styleId="937" w:default="1">
+  <w:style w:type="numbering" w:styleId="940" w:default="1">
     <w:name w:val="No List"/>
     <w:uiPriority w:val="99"/>
     <w:semiHidden/>
@@ -32779,10 +32065,10 @@
       <w:ind/>
     </w:pPr>
   </w:style>
-  <w:style w:type="paragraph" w:styleId="938">
+  <w:style w:type="paragraph" w:styleId="941">
     <w:name w:val="Header"/>
-    <w:basedOn w:val="934"/>
-    <w:link w:val="939"/>
+    <w:basedOn w:val="937"/>
+    <w:link w:val="942"/>
     <w:uiPriority w:val="99"/>
     <w:unhideWhenUsed/>
     <w:pPr>
@@ -32795,10 +32081,10 @@
       <w:ind/>
     </w:pPr>
   </w:style>
-  <w:style w:type="character" w:styleId="939" w:customStyle="1">
+  <w:style w:type="character" w:styleId="942" w:customStyle="1">
     <w:name w:val="Encabezado Car"/>
-    <w:basedOn w:val="935"/>
-    <w:link w:val="938"/>
+    <w:basedOn w:val="938"/>
+    <w:link w:val="941"/>
     <w:uiPriority w:val="99"/>
     <w:pPr>
       <w:pBdr/>
@@ -32810,10 +32096,10 @@
       <w:lang w:eastAsia="es-MX"/>
     </w:rPr>
   </w:style>
-  <w:style w:type="paragraph" w:styleId="940">
+  <w:style w:type="paragraph" w:styleId="943">
     <w:name w:val="Footer"/>
-    <w:basedOn w:val="934"/>
-    <w:link w:val="941"/>
+    <w:basedOn w:val="937"/>
+    <w:link w:val="944"/>
     <w:uiPriority w:val="99"/>
     <w:unhideWhenUsed/>
     <w:pPr>
@@ -32826,10 +32112,10 @@
       <w:ind/>
     </w:pPr>
   </w:style>
-  <w:style w:type="character" w:styleId="941" w:customStyle="1">
+  <w:style w:type="character" w:styleId="944" w:customStyle="1">
     <w:name w:val="Pie de página Car"/>
-    <w:basedOn w:val="935"/>
-    <w:link w:val="940"/>
+    <w:basedOn w:val="938"/>
+    <w:link w:val="943"/>
     <w:uiPriority w:val="99"/>
     <w:pPr>
       <w:pBdr/>
@@ -32841,9 +32127,9 @@
       <w:lang w:eastAsia="es-MX"/>
     </w:rPr>
   </w:style>
-  <w:style w:type="paragraph" w:styleId="942">
+  <w:style w:type="paragraph" w:styleId="945">
     <w:name w:val="List Paragraph"/>
-    <w:basedOn w:val="934"/>
+    <w:basedOn w:val="937"/>
     <w:uiPriority w:val="34"/>
     <w:qFormat/>
     <w:pPr>
@@ -32858,9 +32144,9 @@
       <w:lang w:val="es-ES" w:eastAsia="en-US"/>
     </w:rPr>
   </w:style>
-  <w:style w:type="table" w:styleId="943">
+  <w:style w:type="table" w:styleId="946">
     <w:name w:val="Table Grid"/>
-    <w:basedOn w:val="936"/>
+    <w:basedOn w:val="939"/>
     <w:uiPriority w:val="39"/>
     <w:pPr>
       <w:pBdr/>
@@ -33050,10 +32336,10 @@
       </w:tcPr>
     </w:tblStylePr>
   </w:style>
-  <w:style w:type="paragraph" w:styleId="944">
+  <w:style w:type="paragraph" w:styleId="947">
     <w:name w:val="Subtitle"/>
-    <w:basedOn w:val="934"/>
-    <w:next w:val="934"/>
+    <w:basedOn w:val="937"/>
+    <w:next w:val="937"/>
     <w:pPr>
       <w:keepNext w:val="true"/>
       <w:keepLines w:val="true"/>
@@ -33071,9 +32357,9 @@
       <w:szCs w:val="48"/>
     </w:rPr>
   </w:style>
-  <w:style w:type="table" w:styleId="945">
+  <w:style w:type="table" w:styleId="948">
     <w:name w:val="StGen0"/>
-    <w:basedOn w:val="926"/>
+    <w:basedOn w:val="929"/>
     <w:pPr>
       <w:pBdr/>
       <w:spacing/>

</xml_diff>